<commit_message>
docs: cahier des charges v3.1 et documentation finale actualises
</commit_message>
<xml_diff>
--- a/livrables/Documentation_Technique_Finale.docx
+++ b/livrables/Documentation_Technique_Finale.docx
@@ -164,7 +164,7 @@
           <w:sz w:val="21"/>
           <w:szCs w:val="21"/>
         </w:rPr>
-        <w:t xml:space="preserve">Version du document : v3.0</w:t>
+        <w:t xml:space="preserve">Version du document : v3.1</w:t>
       </w:r>
     </w:p>
     <w:p>
@@ -532,7 +532,7 @@
                 <w:sz w:val="20"/>
                 <w:szCs w:val="20"/>
               </w:rPr>
-              <w:t xml:space="preserve">Reçoit les commandes et fait évoluer leur statut</w:t>
+              <w:t xml:space="preserve">Reçoit les commandes, fait évoluer leur statut, gère son menu</w:t>
             </w:r>
           </w:p>
         </w:tc>
@@ -740,7 +740,7 @@
                 <w:sz w:val="20"/>
                 <w:szCs w:val="20"/>
               </w:rPr>
-              <w:t xml:space="preserve">Supervise l'activité et gère comptes et commandes</w:t>
+              <w:t xml:space="preserve">Supervise l'activité, gère comptes, restaurants et menus</w:t>
             </w:r>
           </w:p>
         </w:tc>
@@ -875,7 +875,7 @@
         </w:numPr>
       </w:pPr>
       <w:r>
-        <w:t xml:space="preserve">Sécurité : JWT (24 h) et bcrypt (12 tours).</w:t>
+        <w:t xml:space="preserve">Notifications : expo-notifications et service Expo Push.</w:t>
       </w:r>
     </w:p>
     <w:p>
@@ -887,23 +887,7 @@
         </w:numPr>
       </w:pPr>
       <w:r>
-        <w:t xml:space="preserve">Compatibilité : Android, iOS et web depuis une seule base de code.</w:t>
-      </w:r>
-    </w:p>
-    <w:p>
-      <w:pPr>
-        <w:pStyle w:val="Heading1"/>
-      </w:pPr>
-      <w:r>
-        <w:t xml:space="preserve">2. Périmètre livré</w:t>
-      </w:r>
-    </w:p>
-    <w:p>
-      <w:pPr>
-        <w:pStyle w:val="Heading2"/>
-      </w:pPr>
-      <w:r>
-        <w:t xml:space="preserve">Inclus</w:t>
+        <w:t xml:space="preserve">Sécurité : JWT (24 h) et bcrypt (12 tours).</w:t>
       </w:r>
     </w:p>
     <w:p>
@@ -915,7 +899,7 @@
         </w:numPr>
       </w:pPr>
       <w:r>
-        <w:t xml:space="preserve">Inscription, connexion, gestion du profil, réinitialisation du mot de passe.</w:t>
+        <w:t xml:space="preserve">Hébergement : Render ou Railway, base MongoDB Atlas.</w:t>
       </w:r>
     </w:p>
     <w:p>
@@ -927,7 +911,23 @@
         </w:numPr>
       </w:pPr>
       <w:r>
-        <w:t xml:space="preserve">Session conservée entre deux lancements de l'application.</w:t>
+        <w:t xml:space="preserve">Compatibilité : Android, iOS et web depuis une seule base de code.</w:t>
+      </w:r>
+    </w:p>
+    <w:p>
+      <w:pPr>
+        <w:pStyle w:val="Heading1"/>
+      </w:pPr>
+      <w:r>
+        <w:t xml:space="preserve">2. Périmètre livré</w:t>
+      </w:r>
+    </w:p>
+    <w:p>
+      <w:pPr>
+        <w:pStyle w:val="Heading2"/>
+      </w:pPr>
+      <w:r>
+        <w:t xml:space="preserve">Inclus</w:t>
       </w:r>
     </w:p>
     <w:p>
@@ -939,7 +939,7 @@
         </w:numPr>
       </w:pPr>
       <w:r>
-        <w:t xml:space="preserve">Menu interactif : catalogue, recherche, fiche restaurant, personnalisation des plats.</w:t>
+        <w:t xml:space="preserve">Inscription, connexion, gestion du profil, réinitialisation du mot de passe.</w:t>
       </w:r>
     </w:p>
     <w:p>
@@ -951,7 +951,7 @@
         </w:numPr>
       </w:pPr>
       <w:r>
-        <w:t xml:space="preserve">Panier multi-lignes et passage de commande.</w:t>
+        <w:t xml:space="preserve">Session conservée entre deux lancements de l'application.</w:t>
       </w:r>
     </w:p>
     <w:p>
@@ -963,7 +963,7 @@
         </w:numPr>
       </w:pPr>
       <w:r>
-        <w:t xml:space="preserve">Paiement par carte (Stripe mode test ou simulation) et paiement à la livraison.</w:t>
+        <w:t xml:space="preserve">Menu interactif : catalogue, recherche, fiche restaurant, personnalisation des plats.</w:t>
       </w:r>
     </w:p>
     <w:p>
@@ -975,7 +975,7 @@
         </w:numPr>
       </w:pPr>
       <w:r>
-        <w:t xml:space="preserve">Suivi en temps réel sur sept statuts, avec historique horodaté.</w:t>
+        <w:t xml:space="preserve">Panier multi-lignes et passage de commande.</w:t>
       </w:r>
     </w:p>
     <w:p>
@@ -987,7 +987,7 @@
         </w:numPr>
       </w:pPr>
       <w:r>
-        <w:t xml:space="preserve">Notation du restaurant après livraison, avec recalcul de la note moyenne.</w:t>
+        <w:t xml:space="preserve">Paiement par carte (Stripe mode test ou simulation) et paiement à la livraison.</w:t>
       </w:r>
     </w:p>
     <w:p>
@@ -999,7 +999,7 @@
         </w:numPr>
       </w:pPr>
       <w:r>
-        <w:t xml:space="preserve">Espaces restaurant, livreur et administrateur.</w:t>
+        <w:t xml:space="preserve">Suivi en temps réel sur sept statuts, avec historique horodaté.</w:t>
       </w:r>
     </w:p>
     <w:p>
@@ -1011,7 +1011,7 @@
         </w:numPr>
       </w:pPr>
       <w:r>
-        <w:t xml:space="preserve">Discussion rattachée à chaque commande.</w:t>
+        <w:t xml:space="preserve">Notation du restaurant après livraison, avec recalcul de la note moyenne.</w:t>
       </w:r>
     </w:p>
     <w:p>
@@ -1023,15 +1023,7 @@
         </w:numPr>
       </w:pPr>
       <w:r>
-        <w:t xml:space="preserve">Carte de livraison affichant la position réelle du livreur.</w:t>
-      </w:r>
-    </w:p>
-    <w:p>
-      <w:pPr>
-        <w:pStyle w:val="Heading2"/>
-      </w:pPr>
-      <w:r>
-        <w:t xml:space="preserve">Exclus</w:t>
+        <w:t xml:space="preserve">Espaces restaurant, livreur et administrateur.</w:t>
       </w:r>
     </w:p>
     <w:p>
@@ -1043,7 +1035,7 @@
         </w:numPr>
       </w:pPr>
       <w:r>
-        <w:t xml:space="preserve">Connexion Google et authentification à deux facteurs.</w:t>
+        <w:t xml:space="preserve">Discussion rattachée à chaque commande.</w:t>
       </w:r>
     </w:p>
     <w:p>
@@ -1055,7 +1047,7 @@
         </w:numPr>
       </w:pPr>
       <w:r>
-        <w:t xml:space="preserve">Notifications poussées.</w:t>
+        <w:t xml:space="preserve">Carte de livraison affichant la position réelle du livreur.</w:t>
       </w:r>
     </w:p>
     <w:p>
@@ -1067,7 +1059,7 @@
         </w:numPr>
       </w:pPr>
       <w:r>
-        <w:t xml:space="preserve">Pourboires et modération des avis.</w:t>
+        <w:t xml:space="preserve">Gestion du menu par le restaurant : plats, options et suppléments.</w:t>
       </w:r>
     </w:p>
     <w:p>
@@ -1079,7 +1071,7 @@
         </w:numPr>
       </w:pPr>
       <w:r>
-        <w:t xml:space="preserve">Gestion du menu par le restaurant depuis l'application.</w:t>
+        <w:t xml:space="preserve">Création d'un établissement et de son gestionnaire par l'administration.</w:t>
       </w:r>
     </w:p>
     <w:p>
@@ -1091,7 +1083,75 @@
         </w:numPr>
       </w:pPr>
       <w:r>
-        <w:t xml:space="preserve">Déploiement du backend sur un hébergeur (Render, Railway).</w:t>
+        <w:t xml:space="preserve">Notifications à chaque étape de la commande.</w:t>
+      </w:r>
+    </w:p>
+    <w:p>
+      <w:pPr>
+        <w:pStyle w:val="ListParagraph"/>
+        <w:numPr>
+          <w:ilvl w:val="0"/>
+          <w:numId w:val="2"/>
+        </w:numPr>
+      </w:pPr>
+      <w:r>
+        <w:t xml:space="preserve">Configuration de déploiement versionnée pour Render et Railway.</w:t>
+      </w:r>
+    </w:p>
+    <w:p>
+      <w:pPr>
+        <w:pStyle w:val="Heading2"/>
+      </w:pPr>
+      <w:r>
+        <w:t xml:space="preserve">Exclus</w:t>
+      </w:r>
+    </w:p>
+    <w:p>
+      <w:pPr>
+        <w:pStyle w:val="ListParagraph"/>
+        <w:numPr>
+          <w:ilvl w:val="0"/>
+          <w:numId w:val="2"/>
+        </w:numPr>
+      </w:pPr>
+      <w:r>
+        <w:t xml:space="preserve">Connexion Google et authentification à deux facteurs.</w:t>
+      </w:r>
+    </w:p>
+    <w:p>
+      <w:pPr>
+        <w:pStyle w:val="ListParagraph"/>
+        <w:numPr>
+          <w:ilvl w:val="0"/>
+          <w:numId w:val="2"/>
+        </w:numPr>
+      </w:pPr>
+      <w:r>
+        <w:t xml:space="preserve">Pourboires et modération des avis.</w:t>
+      </w:r>
+    </w:p>
+    <w:p>
+      <w:pPr>
+        <w:pStyle w:val="ListParagraph"/>
+        <w:numPr>
+          <w:ilvl w:val="0"/>
+          <w:numId w:val="2"/>
+        </w:numPr>
+      </w:pPr>
+      <w:r>
+        <w:t xml:space="preserve">Notifications distantes démontrables sans development build.</w:t>
+      </w:r>
+    </w:p>
+    <w:p>
+      <w:pPr>
+        <w:pStyle w:val="ListParagraph"/>
+        <w:numPr>
+          <w:ilvl w:val="0"/>
+          <w:numId w:val="2"/>
+        </w:numPr>
+      </w:pPr>
+      <w:r>
+        <w:t xml:space="preserve">Auto-suppression du compte par l'utilisateur.</w:t>
       </w:r>
     </w:p>
     <w:p>
@@ -2657,6 +2717,397 @@
           </w:p>
         </w:tc>
       </w:tr>
+      <w:tr>
+        <w:tc>
+          <w:tcPr>
+            <w:tcW w:type="dxa" w:w="771"/>
+            <w:shd w:fill="FBF5EC" w:color="auto" w:val="clear"/>
+            <w:tcMar>
+              <w:top w:type="dxa" w:w="80"/>
+              <w:left w:type="dxa" w:w="110"/>
+              <w:bottom w:type="dxa" w:w="80"/>
+              <w:right w:type="dxa" w:w="110"/>
+            </w:tcMar>
+          </w:tcPr>
+          <w:p>
+            <w:pPr>
+              <w:spacing w:after="0" w:line="260"/>
+            </w:pPr>
+            <w:r>
+              <w:rPr>
+                <w:b w:val="false"/>
+                <w:bCs w:val="false"/>
+                <w:sz w:val="20"/>
+                <w:szCs w:val="20"/>
+              </w:rPr>
+              <w:t xml:space="preserve">US-10</w:t>
+            </w:r>
+          </w:p>
+        </w:tc>
+        <w:tc>
+          <w:tcPr>
+            <w:tcW w:type="dxa" w:w="2643"/>
+            <w:shd w:fill="FBF5EC" w:color="auto" w:val="clear"/>
+            <w:tcMar>
+              <w:top w:type="dxa" w:w="80"/>
+              <w:left w:type="dxa" w:w="110"/>
+              <w:bottom w:type="dxa" w:w="80"/>
+              <w:right w:type="dxa" w:w="110"/>
+            </w:tcMar>
+          </w:tcPr>
+          <w:p>
+            <w:pPr>
+              <w:spacing w:after="0" w:line="260"/>
+            </w:pPr>
+            <w:r>
+              <w:rPr>
+                <w:b w:val="false"/>
+                <w:bCs w:val="false"/>
+                <w:sz w:val="20"/>
+                <w:szCs w:val="20"/>
+              </w:rPr>
+              <w:t xml:space="preserve">Gérer mon menu (restaurant)</w:t>
+            </w:r>
+          </w:p>
+        </w:tc>
+        <w:tc>
+          <w:tcPr>
+            <w:tcW w:type="dxa" w:w="881"/>
+            <w:shd w:fill="FBF5EC" w:color="auto" w:val="clear"/>
+            <w:tcMar>
+              <w:top w:type="dxa" w:w="80"/>
+              <w:left w:type="dxa" w:w="110"/>
+              <w:bottom w:type="dxa" w:w="80"/>
+              <w:right w:type="dxa" w:w="110"/>
+            </w:tcMar>
+          </w:tcPr>
+          <w:p>
+            <w:pPr>
+              <w:spacing w:after="0" w:line="260"/>
+            </w:pPr>
+            <w:r>
+              <w:rPr>
+                <w:b w:val="false"/>
+                <w:bCs w:val="false"/>
+                <w:sz w:val="20"/>
+                <w:szCs w:val="20"/>
+              </w:rPr>
+              <w:t xml:space="preserve">Should</w:t>
+            </w:r>
+          </w:p>
+        </w:tc>
+        <w:tc>
+          <w:tcPr>
+            <w:tcW w:type="dxa" w:w="4295"/>
+            <w:shd w:fill="FBF5EC" w:color="auto" w:val="clear"/>
+            <w:tcMar>
+              <w:top w:type="dxa" w:w="80"/>
+              <w:left w:type="dxa" w:w="110"/>
+              <w:bottom w:type="dxa" w:w="80"/>
+              <w:right w:type="dxa" w:w="110"/>
+            </w:tcMar>
+          </w:tcPr>
+          <w:p>
+            <w:pPr>
+              <w:spacing w:after="0" w:line="260"/>
+            </w:pPr>
+            <w:r>
+              <w:rPr>
+                <w:b w:val="false"/>
+                <w:bCs w:val="false"/>
+                <w:sz w:val="20"/>
+                <w:szCs w:val="20"/>
+              </w:rPr>
+              <w:t xml:space="preserve">Un gestionnaire ne modifie que les plats de son établissement ; sinon 403</w:t>
+            </w:r>
+          </w:p>
+        </w:tc>
+        <w:tc>
+          <w:tcPr>
+            <w:tcW w:type="dxa" w:w="770"/>
+            <w:shd w:fill="FBF5EC" w:color="auto" w:val="clear"/>
+            <w:tcMar>
+              <w:top w:type="dxa" w:w="80"/>
+              <w:left w:type="dxa" w:w="110"/>
+              <w:bottom w:type="dxa" w:w="80"/>
+              <w:right w:type="dxa" w:w="110"/>
+            </w:tcMar>
+          </w:tcPr>
+          <w:p>
+            <w:pPr>
+              <w:spacing w:after="0" w:line="260"/>
+            </w:pPr>
+            <w:r>
+              <w:rPr>
+                <w:b w:val="false"/>
+                <w:bCs w:val="false"/>
+                <w:sz w:val="20"/>
+                <w:szCs w:val="20"/>
+              </w:rPr>
+              <w:t xml:space="preserve">Livré</w:t>
+            </w:r>
+          </w:p>
+        </w:tc>
+      </w:tr>
+      <w:tr>
+        <w:tc>
+          <w:tcPr>
+            <w:tcW w:type="dxa" w:w="771"/>
+            <w:tcMar>
+              <w:top w:type="dxa" w:w="80"/>
+              <w:left w:type="dxa" w:w="110"/>
+              <w:bottom w:type="dxa" w:w="80"/>
+              <w:right w:type="dxa" w:w="110"/>
+            </w:tcMar>
+          </w:tcPr>
+          <w:p>
+            <w:pPr>
+              <w:spacing w:after="0" w:line="260"/>
+            </w:pPr>
+            <w:r>
+              <w:rPr>
+                <w:b w:val="false"/>
+                <w:bCs w:val="false"/>
+                <w:sz w:val="20"/>
+                <w:szCs w:val="20"/>
+              </w:rPr>
+              <w:t xml:space="preserve">US-11</w:t>
+            </w:r>
+          </w:p>
+        </w:tc>
+        <w:tc>
+          <w:tcPr>
+            <w:tcW w:type="dxa" w:w="2643"/>
+            <w:tcMar>
+              <w:top w:type="dxa" w:w="80"/>
+              <w:left w:type="dxa" w:w="110"/>
+              <w:bottom w:type="dxa" w:w="80"/>
+              <w:right w:type="dxa" w:w="110"/>
+            </w:tcMar>
+          </w:tcPr>
+          <w:p>
+            <w:pPr>
+              <w:spacing w:after="0" w:line="260"/>
+            </w:pPr>
+            <w:r>
+              <w:rPr>
+                <w:b w:val="false"/>
+                <w:bCs w:val="false"/>
+                <w:sz w:val="20"/>
+                <w:szCs w:val="20"/>
+              </w:rPr>
+              <w:t xml:space="preserve">Créer un restaurant (admin)</w:t>
+            </w:r>
+          </w:p>
+        </w:tc>
+        <w:tc>
+          <w:tcPr>
+            <w:tcW w:type="dxa" w:w="881"/>
+            <w:tcMar>
+              <w:top w:type="dxa" w:w="80"/>
+              <w:left w:type="dxa" w:w="110"/>
+              <w:bottom w:type="dxa" w:w="80"/>
+              <w:right w:type="dxa" w:w="110"/>
+            </w:tcMar>
+          </w:tcPr>
+          <w:p>
+            <w:pPr>
+              <w:spacing w:after="0" w:line="260"/>
+            </w:pPr>
+            <w:r>
+              <w:rPr>
+                <w:b w:val="false"/>
+                <w:bCs w:val="false"/>
+                <w:sz w:val="20"/>
+                <w:szCs w:val="20"/>
+              </w:rPr>
+              <w:t xml:space="preserve">Should</w:t>
+            </w:r>
+          </w:p>
+        </w:tc>
+        <w:tc>
+          <w:tcPr>
+            <w:tcW w:type="dxa" w:w="4295"/>
+            <w:tcMar>
+              <w:top w:type="dxa" w:w="80"/>
+              <w:left w:type="dxa" w:w="110"/>
+              <w:bottom w:type="dxa" w:w="80"/>
+              <w:right w:type="dxa" w:w="110"/>
+            </w:tcMar>
+          </w:tcPr>
+          <w:p>
+            <w:pPr>
+              <w:spacing w:after="0" w:line="260"/>
+            </w:pPr>
+            <w:r>
+              <w:rPr>
+                <w:b w:val="false"/>
+                <w:bCs w:val="false"/>
+                <w:sz w:val="20"/>
+                <w:szCs w:val="20"/>
+              </w:rPr>
+              <w:t xml:space="preserve">L'établissement et son gestionnaire sont créés en une opération</w:t>
+            </w:r>
+          </w:p>
+        </w:tc>
+        <w:tc>
+          <w:tcPr>
+            <w:tcW w:type="dxa" w:w="770"/>
+            <w:tcMar>
+              <w:top w:type="dxa" w:w="80"/>
+              <w:left w:type="dxa" w:w="110"/>
+              <w:bottom w:type="dxa" w:w="80"/>
+              <w:right w:type="dxa" w:w="110"/>
+            </w:tcMar>
+          </w:tcPr>
+          <w:p>
+            <w:pPr>
+              <w:spacing w:after="0" w:line="260"/>
+            </w:pPr>
+            <w:r>
+              <w:rPr>
+                <w:b w:val="false"/>
+                <w:bCs w:val="false"/>
+                <w:sz w:val="20"/>
+                <w:szCs w:val="20"/>
+              </w:rPr>
+              <w:t xml:space="preserve">Livré</w:t>
+            </w:r>
+          </w:p>
+        </w:tc>
+      </w:tr>
+      <w:tr>
+        <w:tc>
+          <w:tcPr>
+            <w:tcW w:type="dxa" w:w="771"/>
+            <w:shd w:fill="FBF5EC" w:color="auto" w:val="clear"/>
+            <w:tcMar>
+              <w:top w:type="dxa" w:w="80"/>
+              <w:left w:type="dxa" w:w="110"/>
+              <w:bottom w:type="dxa" w:w="80"/>
+              <w:right w:type="dxa" w:w="110"/>
+            </w:tcMar>
+          </w:tcPr>
+          <w:p>
+            <w:pPr>
+              <w:spacing w:after="0" w:line="260"/>
+            </w:pPr>
+            <w:r>
+              <w:rPr>
+                <w:b w:val="false"/>
+                <w:bCs w:val="false"/>
+                <w:sz w:val="20"/>
+                <w:szCs w:val="20"/>
+              </w:rPr>
+              <w:t xml:space="preserve">US-12</w:t>
+            </w:r>
+          </w:p>
+        </w:tc>
+        <w:tc>
+          <w:tcPr>
+            <w:tcW w:type="dxa" w:w="2643"/>
+            <w:shd w:fill="FBF5EC" w:color="auto" w:val="clear"/>
+            <w:tcMar>
+              <w:top w:type="dxa" w:w="80"/>
+              <w:left w:type="dxa" w:w="110"/>
+              <w:bottom w:type="dxa" w:w="80"/>
+              <w:right w:type="dxa" w:w="110"/>
+            </w:tcMar>
+          </w:tcPr>
+          <w:p>
+            <w:pPr>
+              <w:spacing w:after="0" w:line="260"/>
+            </w:pPr>
+            <w:r>
+              <w:rPr>
+                <w:b w:val="false"/>
+                <w:bCs w:val="false"/>
+                <w:sz w:val="20"/>
+                <w:szCs w:val="20"/>
+              </w:rPr>
+              <w:t xml:space="preserve">Être averti à chaque étape (client)</w:t>
+            </w:r>
+          </w:p>
+        </w:tc>
+        <w:tc>
+          <w:tcPr>
+            <w:tcW w:type="dxa" w:w="881"/>
+            <w:shd w:fill="FBF5EC" w:color="auto" w:val="clear"/>
+            <w:tcMar>
+              <w:top w:type="dxa" w:w="80"/>
+              <w:left w:type="dxa" w:w="110"/>
+              <w:bottom w:type="dxa" w:w="80"/>
+              <w:right w:type="dxa" w:w="110"/>
+            </w:tcMar>
+          </w:tcPr>
+          <w:p>
+            <w:pPr>
+              <w:spacing w:after="0" w:line="260"/>
+            </w:pPr>
+            <w:r>
+              <w:rPr>
+                <w:b w:val="false"/>
+                <w:bCs w:val="false"/>
+                <w:sz w:val="20"/>
+                <w:szCs w:val="20"/>
+              </w:rPr>
+              <w:t xml:space="preserve">Could</w:t>
+            </w:r>
+          </w:p>
+        </w:tc>
+        <w:tc>
+          <w:tcPr>
+            <w:tcW w:type="dxa" w:w="4295"/>
+            <w:shd w:fill="FBF5EC" w:color="auto" w:val="clear"/>
+            <w:tcMar>
+              <w:top w:type="dxa" w:w="80"/>
+              <w:left w:type="dxa" w:w="110"/>
+              <w:bottom w:type="dxa" w:w="80"/>
+              <w:right w:type="dxa" w:w="110"/>
+            </w:tcMar>
+          </w:tcPr>
+          <w:p>
+            <w:pPr>
+              <w:spacing w:after="0" w:line="260"/>
+            </w:pPr>
+            <w:r>
+              <w:rPr>
+                <w:b w:val="false"/>
+                <w:bCs w:val="false"/>
+                <w:sz w:val="20"/>
+                <w:szCs w:val="20"/>
+              </w:rPr>
+              <w:t xml:space="preserve">Une notification s'affiche à chaque changement de statut</w:t>
+            </w:r>
+          </w:p>
+        </w:tc>
+        <w:tc>
+          <w:tcPr>
+            <w:tcW w:type="dxa" w:w="770"/>
+            <w:shd w:fill="FBF5EC" w:color="auto" w:val="clear"/>
+            <w:tcMar>
+              <w:top w:type="dxa" w:w="80"/>
+              <w:left w:type="dxa" w:w="110"/>
+              <w:bottom w:type="dxa" w:w="80"/>
+              <w:right w:type="dxa" w:w="110"/>
+            </w:tcMar>
+          </w:tcPr>
+          <w:p>
+            <w:pPr>
+              <w:spacing w:after="0" w:line="260"/>
+            </w:pPr>
+            <w:r>
+              <w:rPr>
+                <w:b w:val="false"/>
+                <w:bCs w:val="false"/>
+                <w:sz w:val="20"/>
+                <w:szCs w:val="20"/>
+              </w:rPr>
+              <w:t xml:space="preserve">Livré</w:t>
+            </w:r>
+          </w:p>
+        </w:tc>
+      </w:tr>
     </w:tbl>
     <w:p>
       <w:pPr>
@@ -2933,7 +3384,7 @@
                 <w:sz w:val="20"/>
                 <w:szCs w:val="20"/>
               </w:rPr>
-              <w:t xml:space="preserve">Règles métier pures : tarification, machine à états, paiement — testables sans base de données</w:t>
+              <w:t xml:space="preserve">Règles métier pures : tarification, statuts, validation du menu, paiement, notifications — testables sans base de données</w:t>
             </w:r>
           </w:p>
         </w:tc>
@@ -3207,7 +3658,7 @@
                 <w:sz w:val="20"/>
                 <w:szCs w:val="20"/>
               </w:rPr>
-              <w:t xml:space="preserve">Les règles métier étaient auparavant mélangées au code HTTP des contrôleurs. Le taux de taxes existait à deux endroits, la machine à états à un seul mais impossible à tester sans démarrer le serveur. Les extraire a permis d'écrire 16 tests unitaires qui s'exécutent en moins d'une seconde, sans MongoDB ni réseau.</w:t>
+              <w:t xml:space="preserve">Les règles métier étaient auparavant mélangées au code HTTP des contrôleurs. Le taux de taxes existait à deux endroits, la machine à états à un seul mais impossible à tester sans démarrer le serveur. Les extraire a permis d'écrire 30 tests unitaires qui s'exécutent en moins d'une seconde, sans MongoDB ni réseau.</w:t>
             </w:r>
           </w:p>
         </w:tc>
@@ -3223,7 +3674,7 @@
     </w:p>
     <w:p>
       <w:r>
-        <w:t xml:space="preserve">Six collections MongoDB : utilisateurs, restaurants, plats, commandes, messages, avis.</w:t>
+        <w:t xml:space="preserve">Sept collections MongoDB : utilisateurs, restaurants, plats, commandes, messages, avis, et les appareils enregistrés pour les notifications.</w:t>
       </w:r>
     </w:p>
     <w:p>
@@ -4850,7 +5301,733 @@
         <w:pStyle w:val="Heading2"/>
       </w:pPr>
       <w:r>
-        <w:t xml:space="preserve">5.6 Séquence — passer une commande</w:t>
+        <w:t xml:space="preserve">5.6 Gestion du catalogue</w:t>
+      </w:r>
+    </w:p>
+    <w:p>
+      <w:r>
+        <w:t xml:space="preserve">Le catalogue n'est plus figé dans un script de démarrage. Deux rôles le font évoluer, à travers un contrôleur unique.</w:t>
+      </w:r>
+    </w:p>
+    <w:p>
+      <w:pPr>
+        <w:spacing w:after="120"/>
+      </w:pPr>
+    </w:p>
+    <w:tbl>
+      <w:tblPr>
+        <w:tblW w:type="dxa" w:w="9360"/>
+        <w:tblBorders>
+          <w:top w:val="single" w:color="D8C7B4" w:sz="4"/>
+          <w:left w:val="single" w:color="D8C7B4" w:sz="4"/>
+          <w:bottom w:val="single" w:color="D8C7B4" w:sz="4"/>
+          <w:right w:val="single" w:color="D8C7B4" w:sz="4"/>
+          <w:insideH w:val="single" w:color="E9DDD0" w:sz="2"/>
+          <w:insideV w:val="single" w:color="E9DDD0" w:sz="2"/>
+        </w:tblBorders>
+      </w:tblPr>
+      <w:tblGrid>
+        <w:gridCol w:w="2202"/>
+        <w:gridCol w:w="2863"/>
+        <w:gridCol w:w="4295"/>
+      </w:tblGrid>
+      <w:tr>
+        <w:trPr>
+          <w:tblHeader/>
+        </w:trPr>
+        <w:tc>
+          <w:tcPr>
+            <w:tcW w:type="dxa" w:w="2202"/>
+            <w:shd w:fill="F2E3D6" w:color="auto" w:val="clear"/>
+            <w:tcMar>
+              <w:top w:type="dxa" w:w="80"/>
+              <w:left w:type="dxa" w:w="110"/>
+              <w:bottom w:type="dxa" w:w="80"/>
+              <w:right w:type="dxa" w:w="110"/>
+            </w:tcMar>
+          </w:tcPr>
+          <w:p>
+            <w:pPr>
+              <w:spacing w:after="0" w:line="260"/>
+            </w:pPr>
+            <w:r>
+              <w:rPr>
+                <w:b/>
+                <w:bCs/>
+                <w:sz w:val="20"/>
+                <w:szCs w:val="20"/>
+              </w:rPr>
+              <w:t xml:space="preserve">Rôle</w:t>
+            </w:r>
+          </w:p>
+        </w:tc>
+        <w:tc>
+          <w:tcPr>
+            <w:tcW w:type="dxa" w:w="2863"/>
+            <w:shd w:fill="F2E3D6" w:color="auto" w:val="clear"/>
+            <w:tcMar>
+              <w:top w:type="dxa" w:w="80"/>
+              <w:left w:type="dxa" w:w="110"/>
+              <w:bottom w:type="dxa" w:w="80"/>
+              <w:right w:type="dxa" w:w="110"/>
+            </w:tcMar>
+          </w:tcPr>
+          <w:p>
+            <w:pPr>
+              <w:spacing w:after="0" w:line="260"/>
+            </w:pPr>
+            <w:r>
+              <w:rPr>
+                <w:b/>
+                <w:bCs/>
+                <w:sz w:val="20"/>
+                <w:szCs w:val="20"/>
+              </w:rPr>
+              <w:t xml:space="preserve">Portée</w:t>
+            </w:r>
+          </w:p>
+        </w:tc>
+        <w:tc>
+          <w:tcPr>
+            <w:tcW w:type="dxa" w:w="4295"/>
+            <w:shd w:fill="F2E3D6" w:color="auto" w:val="clear"/>
+            <w:tcMar>
+              <w:top w:type="dxa" w:w="80"/>
+              <w:left w:type="dxa" w:w="110"/>
+              <w:bottom w:type="dxa" w:w="80"/>
+              <w:right w:type="dxa" w:w="110"/>
+            </w:tcMar>
+          </w:tcPr>
+          <w:p>
+            <w:pPr>
+              <w:spacing w:after="0" w:line="260"/>
+            </w:pPr>
+            <w:r>
+              <w:rPr>
+                <w:b/>
+                <w:bCs/>
+                <w:sz w:val="20"/>
+                <w:szCs w:val="20"/>
+              </w:rPr>
+              <w:t xml:space="preserve">Routes</w:t>
+            </w:r>
+          </w:p>
+        </w:tc>
+      </w:tr>
+      <w:tr>
+        <w:tc>
+          <w:tcPr>
+            <w:tcW w:type="dxa" w:w="2202"/>
+            <w:tcMar>
+              <w:top w:type="dxa" w:w="80"/>
+              <w:left w:type="dxa" w:w="110"/>
+              <w:bottom w:type="dxa" w:w="80"/>
+              <w:right w:type="dxa" w:w="110"/>
+            </w:tcMar>
+          </w:tcPr>
+          <w:p>
+            <w:pPr>
+              <w:spacing w:after="0" w:line="260"/>
+            </w:pPr>
+            <w:r>
+              <w:rPr>
+                <w:b w:val="false"/>
+                <w:bCs w:val="false"/>
+                <w:sz w:val="20"/>
+                <w:szCs w:val="20"/>
+              </w:rPr>
+              <w:t xml:space="preserve">Administrateur</w:t>
+            </w:r>
+          </w:p>
+        </w:tc>
+        <w:tc>
+          <w:tcPr>
+            <w:tcW w:type="dxa" w:w="2863"/>
+            <w:tcMar>
+              <w:top w:type="dxa" w:w="80"/>
+              <w:left w:type="dxa" w:w="110"/>
+              <w:bottom w:type="dxa" w:w="80"/>
+              <w:right w:type="dxa" w:w="110"/>
+            </w:tcMar>
+          </w:tcPr>
+          <w:p>
+            <w:pPr>
+              <w:spacing w:after="0" w:line="260"/>
+            </w:pPr>
+            <w:r>
+              <w:rPr>
+                <w:b w:val="false"/>
+                <w:bCs w:val="false"/>
+                <w:sz w:val="20"/>
+                <w:szCs w:val="20"/>
+              </w:rPr>
+              <w:t xml:space="preserve">N'importe quel établissement</w:t>
+            </w:r>
+          </w:p>
+        </w:tc>
+        <w:tc>
+          <w:tcPr>
+            <w:tcW w:type="dxa" w:w="4295"/>
+            <w:tcMar>
+              <w:top w:type="dxa" w:w="80"/>
+              <w:left w:type="dxa" w:w="110"/>
+              <w:bottom w:type="dxa" w:w="80"/>
+              <w:right w:type="dxa" w:w="110"/>
+            </w:tcMar>
+          </w:tcPr>
+          <w:p>
+            <w:pPr>
+              <w:spacing w:after="0" w:line="260"/>
+            </w:pPr>
+            <w:r>
+              <w:rPr>
+                <w:b w:val="false"/>
+                <w:bCs w:val="false"/>
+                <w:sz w:val="20"/>
+                <w:szCs w:val="20"/>
+              </w:rPr>
+              <w:t xml:space="preserve">/api/admin/restaurants et /api/admin/plats</w:t>
+            </w:r>
+          </w:p>
+        </w:tc>
+      </w:tr>
+      <w:tr>
+        <w:tc>
+          <w:tcPr>
+            <w:tcW w:type="dxa" w:w="2202"/>
+            <w:shd w:fill="FBF5EC" w:color="auto" w:val="clear"/>
+            <w:tcMar>
+              <w:top w:type="dxa" w:w="80"/>
+              <w:left w:type="dxa" w:w="110"/>
+              <w:bottom w:type="dxa" w:w="80"/>
+              <w:right w:type="dxa" w:w="110"/>
+            </w:tcMar>
+          </w:tcPr>
+          <w:p>
+            <w:pPr>
+              <w:spacing w:after="0" w:line="260"/>
+            </w:pPr>
+            <w:r>
+              <w:rPr>
+                <w:b w:val="false"/>
+                <w:bCs w:val="false"/>
+                <w:sz w:val="20"/>
+                <w:szCs w:val="20"/>
+              </w:rPr>
+              <w:t xml:space="preserve">Gestionnaire de restaurant</w:t>
+            </w:r>
+          </w:p>
+        </w:tc>
+        <w:tc>
+          <w:tcPr>
+            <w:tcW w:type="dxa" w:w="2863"/>
+            <w:shd w:fill="FBF5EC" w:color="auto" w:val="clear"/>
+            <w:tcMar>
+              <w:top w:type="dxa" w:w="80"/>
+              <w:left w:type="dxa" w:w="110"/>
+              <w:bottom w:type="dxa" w:w="80"/>
+              <w:right w:type="dxa" w:w="110"/>
+            </w:tcMar>
+          </w:tcPr>
+          <w:p>
+            <w:pPr>
+              <w:spacing w:after="0" w:line="260"/>
+            </w:pPr>
+            <w:r>
+              <w:rPr>
+                <w:b w:val="false"/>
+                <w:bCs w:val="false"/>
+                <w:sz w:val="20"/>
+                <w:szCs w:val="20"/>
+              </w:rPr>
+              <w:t xml:space="preserve">Uniquement le sien</w:t>
+            </w:r>
+          </w:p>
+        </w:tc>
+        <w:tc>
+          <w:tcPr>
+            <w:tcW w:type="dxa" w:w="4295"/>
+            <w:shd w:fill="FBF5EC" w:color="auto" w:val="clear"/>
+            <w:tcMar>
+              <w:top w:type="dxa" w:w="80"/>
+              <w:left w:type="dxa" w:w="110"/>
+              <w:bottom w:type="dxa" w:w="80"/>
+              <w:right w:type="dxa" w:w="110"/>
+            </w:tcMar>
+          </w:tcPr>
+          <w:p>
+            <w:pPr>
+              <w:spacing w:after="0" w:line="260"/>
+            </w:pPr>
+            <w:r>
+              <w:rPr>
+                <w:b w:val="false"/>
+                <w:bCs w:val="false"/>
+                <w:sz w:val="20"/>
+                <w:szCs w:val="20"/>
+              </w:rPr>
+              <w:t xml:space="preserve">/api/mon-restaurant</w:t>
+            </w:r>
+          </w:p>
+        </w:tc>
+      </w:tr>
+    </w:tbl>
+    <w:p>
+      <w:pPr>
+        <w:spacing w:after="120"/>
+      </w:pPr>
+    </w:p>
+    <w:p>
+      <w:r>
+        <w:t xml:space="preserve">Le cloisonnement ne repose pas sur la route appelée mais sur une fonction de résolution qui vérifie le droit d'accès à chaque appel. Un gestionnaire qui viserait un autre établissement par l'URL reçoit un 403 explicite, et non une redirection silencieuse.</w:t>
+      </w:r>
+    </w:p>
+    <w:p>
+      <w:pPr>
+        <w:spacing w:after="120"/>
+      </w:pPr>
+    </w:p>
+    <w:tbl>
+      <w:tblPr>
+        <w:tblW w:type="dxa" w:w="9360"/>
+        <w:tblBorders>
+          <w:top w:val="single" w:color="E9DDD0" w:sz="2"/>
+          <w:left w:val="single" w:color="C84E18" w:sz="18"/>
+          <w:bottom w:val="single" w:color="E9DDD0" w:sz="2"/>
+          <w:right w:val="single" w:color="E9DDD0" w:sz="2"/>
+          <w:insideH w:val="none"/>
+          <w:insideV w:val="none"/>
+        </w:tblBorders>
+      </w:tblPr>
+      <w:tblGrid>
+        <w:gridCol w:w="9360"/>
+      </w:tblGrid>
+      <w:tr>
+        <w:tc>
+          <w:tcPr>
+            <w:tcW w:type="dxa" w:w="9360"/>
+            <w:shd w:fill="FBF5EC" w:color="auto" w:val="clear"/>
+            <w:tcMar>
+              <w:top w:type="dxa" w:w="140"/>
+              <w:left w:type="dxa" w:w="180"/>
+              <w:bottom w:type="dxa" w:w="140"/>
+              <w:right w:type="dxa" w:w="160"/>
+            </w:tcMar>
+          </w:tcPr>
+          <w:p>
+            <w:pPr>
+              <w:spacing w:after="60"/>
+            </w:pPr>
+            <w:r>
+              <w:rPr>
+                <w:b/>
+                <w:bCs/>
+                <w:color w:val="C84E18"/>
+                <w:sz w:val="20"/>
+                <w:szCs w:val="20"/>
+              </w:rPr>
+              <w:t xml:space="preserve">Deux règles à souligner en présentation</w:t>
+            </w:r>
+          </w:p>
+          <w:p>
+            <w:pPr>
+              <w:spacing w:after="0" w:line="280"/>
+            </w:pPr>
+            <w:r>
+              <w:rPr>
+                <w:sz w:val="20"/>
+                <w:szCs w:val="20"/>
+              </w:rPr>
+              <w:t xml:space="preserve">La note d'un restaurant n'est jamais acceptée en écriture : elle est calculée à partir des avis réels, sans quoi un formulaire permettrait de la truquer. Et retirer un plat ne le supprime pas : il devient indisponible, car des commandes passées le référencent et l'effacer casserait l'historique.</w:t>
+            </w:r>
+          </w:p>
+        </w:tc>
+      </w:tr>
+    </w:tbl>
+    <w:p>
+      <w:pPr>
+        <w:spacing w:after="120"/>
+      </w:pPr>
+    </w:p>
+    <w:p>
+      <w:r>
+        <w:rPr>
+          <w:i/>
+          <w:iCs/>
+        </w:rPr>
+        <w:t xml:space="preserve">Le script de chargement des données de démonstration est devenu non destructif : il crée ce qui manque et met à jour ce qui existe. Les restaurants créés depuis l'application survivent donc à un rechargement.</w:t>
+      </w:r>
+    </w:p>
+    <w:p>
+      <w:pPr>
+        <w:pStyle w:val="Heading2"/>
+      </w:pPr>
+      <w:r>
+        <w:t xml:space="preserve">5.7 Notifications</w:t>
+      </w:r>
+    </w:p>
+    <w:p>
+      <w:r>
+        <w:t xml:space="preserve">Deux canaux complémentaires, pour la même raison que le double mode de paiement : la démonstration doit fonctionner dans Expo Go.</w:t>
+      </w:r>
+    </w:p>
+    <w:p>
+      <w:pPr>
+        <w:spacing w:after="120"/>
+      </w:pPr>
+    </w:p>
+    <w:tbl>
+      <w:tblPr>
+        <w:tblW w:type="dxa" w:w="9360"/>
+        <w:tblBorders>
+          <w:top w:val="single" w:color="D8C7B4" w:sz="4"/>
+          <w:left w:val="single" w:color="D8C7B4" w:sz="4"/>
+          <w:bottom w:val="single" w:color="D8C7B4" w:sz="4"/>
+          <w:right w:val="single" w:color="D8C7B4" w:sz="4"/>
+          <w:insideH w:val="single" w:color="E9DDD0" w:sz="2"/>
+          <w:insideV w:val="single" w:color="E9DDD0" w:sz="2"/>
+        </w:tblBorders>
+      </w:tblPr>
+      <w:tblGrid>
+        <w:gridCol w:w="1542"/>
+        <w:gridCol w:w="2863"/>
+        <w:gridCol w:w="2423"/>
+        <w:gridCol w:w="2532"/>
+      </w:tblGrid>
+      <w:tr>
+        <w:trPr>
+          <w:tblHeader/>
+        </w:trPr>
+        <w:tc>
+          <w:tcPr>
+            <w:tcW w:type="dxa" w:w="1542"/>
+            <w:shd w:fill="F2E3D6" w:color="auto" w:val="clear"/>
+            <w:tcMar>
+              <w:top w:type="dxa" w:w="80"/>
+              <w:left w:type="dxa" w:w="110"/>
+              <w:bottom w:type="dxa" w:w="80"/>
+              <w:right w:type="dxa" w:w="110"/>
+            </w:tcMar>
+          </w:tcPr>
+          <w:p>
+            <w:pPr>
+              <w:spacing w:after="0" w:line="260"/>
+            </w:pPr>
+            <w:r>
+              <w:rPr>
+                <w:b/>
+                <w:bCs/>
+                <w:sz w:val="20"/>
+                <w:szCs w:val="20"/>
+              </w:rPr>
+              <w:t xml:space="preserve">Canal</w:t>
+            </w:r>
+          </w:p>
+        </w:tc>
+        <w:tc>
+          <w:tcPr>
+            <w:tcW w:type="dxa" w:w="2863"/>
+            <w:shd w:fill="F2E3D6" w:color="auto" w:val="clear"/>
+            <w:tcMar>
+              <w:top w:type="dxa" w:w="80"/>
+              <w:left w:type="dxa" w:w="110"/>
+              <w:bottom w:type="dxa" w:w="80"/>
+              <w:right w:type="dxa" w:w="110"/>
+            </w:tcMar>
+          </w:tcPr>
+          <w:p>
+            <w:pPr>
+              <w:spacing w:after="0" w:line="260"/>
+            </w:pPr>
+            <w:r>
+              <w:rPr>
+                <w:b/>
+                <w:bCs/>
+                <w:sz w:val="20"/>
+                <w:szCs w:val="20"/>
+              </w:rPr>
+              <w:t xml:space="preserve">Mécanisme</w:t>
+            </w:r>
+          </w:p>
+        </w:tc>
+        <w:tc>
+          <w:tcPr>
+            <w:tcW w:type="dxa" w:w="2423"/>
+            <w:shd w:fill="F2E3D6" w:color="auto" w:val="clear"/>
+            <w:tcMar>
+              <w:top w:type="dxa" w:w="80"/>
+              <w:left w:type="dxa" w:w="110"/>
+              <w:bottom w:type="dxa" w:w="80"/>
+              <w:right w:type="dxa" w:w="110"/>
+            </w:tcMar>
+          </w:tcPr>
+          <w:p>
+            <w:pPr>
+              <w:spacing w:after="0" w:line="260"/>
+            </w:pPr>
+            <w:r>
+              <w:rPr>
+                <w:b/>
+                <w:bCs/>
+                <w:sz w:val="20"/>
+                <w:szCs w:val="20"/>
+              </w:rPr>
+              <w:t xml:space="preserve">Portée</w:t>
+            </w:r>
+          </w:p>
+        </w:tc>
+        <w:tc>
+          <w:tcPr>
+            <w:tcW w:type="dxa" w:w="2532"/>
+            <w:shd w:fill="F2E3D6" w:color="auto" w:val="clear"/>
+            <w:tcMar>
+              <w:top w:type="dxa" w:w="80"/>
+              <w:left w:type="dxa" w:w="110"/>
+              <w:bottom w:type="dxa" w:w="80"/>
+              <w:right w:type="dxa" w:w="110"/>
+            </w:tcMar>
+          </w:tcPr>
+          <w:p>
+            <w:pPr>
+              <w:spacing w:after="0" w:line="260"/>
+            </w:pPr>
+            <w:r>
+              <w:rPr>
+                <w:b/>
+                <w:bCs/>
+                <w:sz w:val="20"/>
+                <w:szCs w:val="20"/>
+              </w:rPr>
+              <w:t xml:space="preserve">Limite</w:t>
+            </w:r>
+          </w:p>
+        </w:tc>
+      </w:tr>
+      <w:tr>
+        <w:tc>
+          <w:tcPr>
+            <w:tcW w:type="dxa" w:w="1542"/>
+            <w:tcMar>
+              <w:top w:type="dxa" w:w="80"/>
+              <w:left w:type="dxa" w:w="110"/>
+              <w:bottom w:type="dxa" w:w="80"/>
+              <w:right w:type="dxa" w:w="110"/>
+            </w:tcMar>
+          </w:tcPr>
+          <w:p>
+            <w:pPr>
+              <w:spacing w:after="0" w:line="260"/>
+            </w:pPr>
+            <w:r>
+              <w:rPr>
+                <w:b w:val="false"/>
+                <w:bCs w:val="false"/>
+                <w:sz w:val="20"/>
+                <w:szCs w:val="20"/>
+              </w:rPr>
+              <w:t xml:space="preserve">Push distantes</w:t>
+            </w:r>
+          </w:p>
+        </w:tc>
+        <w:tc>
+          <w:tcPr>
+            <w:tcW w:type="dxa" w:w="2863"/>
+            <w:tcMar>
+              <w:top w:type="dxa" w:w="80"/>
+              <w:left w:type="dxa" w:w="110"/>
+              <w:bottom w:type="dxa" w:w="80"/>
+              <w:right w:type="dxa" w:w="110"/>
+            </w:tcMar>
+          </w:tcPr>
+          <w:p>
+            <w:pPr>
+              <w:spacing w:after="0" w:line="260"/>
+            </w:pPr>
+            <w:r>
+              <w:rPr>
+                <w:b w:val="false"/>
+                <w:bCs w:val="false"/>
+                <w:sz w:val="20"/>
+                <w:szCs w:val="20"/>
+              </w:rPr>
+              <w:t xml:space="preserve">Le serveur appelle le service Expo Push</w:t>
+            </w:r>
+          </w:p>
+        </w:tc>
+        <w:tc>
+          <w:tcPr>
+            <w:tcW w:type="dxa" w:w="2423"/>
+            <w:tcMar>
+              <w:top w:type="dxa" w:w="80"/>
+              <w:left w:type="dxa" w:w="110"/>
+              <w:bottom w:type="dxa" w:w="80"/>
+              <w:right w:type="dxa" w:w="110"/>
+            </w:tcMar>
+          </w:tcPr>
+          <w:p>
+            <w:pPr>
+              <w:spacing w:after="0" w:line="260"/>
+            </w:pPr>
+            <w:r>
+              <w:rPr>
+                <w:b w:val="false"/>
+                <w:bCs w:val="false"/>
+                <w:sz w:val="20"/>
+                <w:szCs w:val="20"/>
+              </w:rPr>
+              <w:t xml:space="preserve">Atteint l'appareil application fermée</w:t>
+            </w:r>
+          </w:p>
+        </w:tc>
+        <w:tc>
+          <w:tcPr>
+            <w:tcW w:type="dxa" w:w="2532"/>
+            <w:tcMar>
+              <w:top w:type="dxa" w:w="80"/>
+              <w:left w:type="dxa" w:w="110"/>
+              <w:bottom w:type="dxa" w:w="80"/>
+              <w:right w:type="dxa" w:w="110"/>
+            </w:tcMar>
+          </w:tcPr>
+          <w:p>
+            <w:pPr>
+              <w:spacing w:after="0" w:line="260"/>
+            </w:pPr>
+            <w:r>
+              <w:rPr>
+                <w:b w:val="false"/>
+                <w:bCs w:val="false"/>
+                <w:sz w:val="20"/>
+                <w:szCs w:val="20"/>
+              </w:rPr>
+              <w:t xml:space="preserve">Ne fonctionne plus dans Expo Go sur Android depuis le SDK 53</w:t>
+            </w:r>
+          </w:p>
+        </w:tc>
+      </w:tr>
+      <w:tr>
+        <w:tc>
+          <w:tcPr>
+            <w:tcW w:type="dxa" w:w="1542"/>
+            <w:shd w:fill="FBF5EC" w:color="auto" w:val="clear"/>
+            <w:tcMar>
+              <w:top w:type="dxa" w:w="80"/>
+              <w:left w:type="dxa" w:w="110"/>
+              <w:bottom w:type="dxa" w:w="80"/>
+              <w:right w:type="dxa" w:w="110"/>
+            </w:tcMar>
+          </w:tcPr>
+          <w:p>
+            <w:pPr>
+              <w:spacing w:after="0" w:line="260"/>
+            </w:pPr>
+            <w:r>
+              <w:rPr>
+                <w:b w:val="false"/>
+                <w:bCs w:val="false"/>
+                <w:sz w:val="20"/>
+                <w:szCs w:val="20"/>
+              </w:rPr>
+              <w:t xml:space="preserve">Notification locale</w:t>
+            </w:r>
+          </w:p>
+        </w:tc>
+        <w:tc>
+          <w:tcPr>
+            <w:tcW w:type="dxa" w:w="2863"/>
+            <w:shd w:fill="FBF5EC" w:color="auto" w:val="clear"/>
+            <w:tcMar>
+              <w:top w:type="dxa" w:w="80"/>
+              <w:left w:type="dxa" w:w="110"/>
+              <w:bottom w:type="dxa" w:w="80"/>
+              <w:right w:type="dxa" w:w="110"/>
+            </w:tcMar>
+          </w:tcPr>
+          <w:p>
+            <w:pPr>
+              <w:spacing w:after="0" w:line="260"/>
+            </w:pPr>
+            <w:r>
+              <w:rPr>
+                <w:b w:val="false"/>
+                <w:bCs w:val="false"/>
+                <w:sz w:val="20"/>
+                <w:szCs w:val="20"/>
+              </w:rPr>
+              <w:t xml:space="preserve">L'application l'affiche à la réception d'un événement Socket.IO</w:t>
+            </w:r>
+          </w:p>
+        </w:tc>
+        <w:tc>
+          <w:tcPr>
+            <w:tcW w:type="dxa" w:w="2423"/>
+            <w:shd w:fill="FBF5EC" w:color="auto" w:val="clear"/>
+            <w:tcMar>
+              <w:top w:type="dxa" w:w="80"/>
+              <w:left w:type="dxa" w:w="110"/>
+              <w:bottom w:type="dxa" w:w="80"/>
+              <w:right w:type="dxa" w:w="110"/>
+            </w:tcMar>
+          </w:tcPr>
+          <w:p>
+            <w:pPr>
+              <w:spacing w:after="0" w:line="260"/>
+            </w:pPr>
+            <w:r>
+              <w:rPr>
+                <w:b w:val="false"/>
+                <w:bCs w:val="false"/>
+                <w:sz w:val="20"/>
+                <w:szCs w:val="20"/>
+              </w:rPr>
+              <w:t xml:space="preserve">Fonctionne partout, Expo Go compris</w:t>
+            </w:r>
+          </w:p>
+        </w:tc>
+        <w:tc>
+          <w:tcPr>
+            <w:tcW w:type="dxa" w:w="2532"/>
+            <w:shd w:fill="FBF5EC" w:color="auto" w:val="clear"/>
+            <w:tcMar>
+              <w:top w:type="dxa" w:w="80"/>
+              <w:left w:type="dxa" w:w="110"/>
+              <w:bottom w:type="dxa" w:w="80"/>
+              <w:right w:type="dxa" w:w="110"/>
+            </w:tcMar>
+          </w:tcPr>
+          <w:p>
+            <w:pPr>
+              <w:spacing w:after="0" w:line="260"/>
+            </w:pPr>
+            <w:r>
+              <w:rPr>
+                <w:b w:val="false"/>
+                <w:bCs w:val="false"/>
+                <w:sz w:val="20"/>
+                <w:szCs w:val="20"/>
+              </w:rPr>
+              <w:t xml:space="preserve">Uniquement application ouverte</w:t>
+            </w:r>
+          </w:p>
+        </w:tc>
+      </w:tr>
+    </w:tbl>
+    <w:p>
+      <w:pPr>
+        <w:spacing w:after="120"/>
+      </w:pPr>
+    </w:p>
+    <w:p>
+      <w:r>
+        <w:t xml:space="preserve">Les erreurs d'envoi sont absorbées et journalisées : une notification perdue est moins grave qu'un changement de statut qui échouerait à cause d'elle. Les jetons signalés comme désinscrits par Expo sont supprimés automatiquement, et le jeton est retiré à la déconnexion pour qu'un téléphone partagé ne reçoive pas les commandes du compte précédent.</w:t>
+      </w:r>
+    </w:p>
+    <w:p>
+      <w:pPr>
+        <w:pStyle w:val="Heading2"/>
+      </w:pPr>
+      <w:r>
+        <w:t xml:space="preserve">5.8 Séquence — passer une commande</w:t>
       </w:r>
     </w:p>
     <w:p>
@@ -6424,6 +7601,240 @@
                 <w:szCs w:val="20"/>
               </w:rPr>
               <w:t xml:space="preserve">services/stockage.ts</w:t>
+            </w:r>
+          </w:p>
+        </w:tc>
+      </w:tr>
+      <w:tr>
+        <w:tc>
+          <w:tcPr>
+            <w:tcW w:type="dxa" w:w="2423"/>
+            <w:tcMar>
+              <w:top w:type="dxa" w:w="80"/>
+              <w:left w:type="dxa" w:w="110"/>
+              <w:bottom w:type="dxa" w:w="80"/>
+              <w:right w:type="dxa" w:w="110"/>
+            </w:tcMar>
+          </w:tcPr>
+          <w:p>
+            <w:pPr>
+              <w:spacing w:after="0" w:line="260"/>
+            </w:pPr>
+            <w:r>
+              <w:rPr>
+                <w:b w:val="false"/>
+                <w:bCs w:val="false"/>
+                <w:sz w:val="20"/>
+                <w:szCs w:val="20"/>
+              </w:rPr>
+              <w:t xml:space="preserve">Note de restaurant truquée</w:t>
+            </w:r>
+          </w:p>
+        </w:tc>
+        <w:tc>
+          <w:tcPr>
+            <w:tcW w:type="dxa" w:w="5065"/>
+            <w:tcMar>
+              <w:top w:type="dxa" w:w="80"/>
+              <w:left w:type="dxa" w:w="110"/>
+              <w:bottom w:type="dxa" w:w="80"/>
+              <w:right w:type="dxa" w:w="110"/>
+            </w:tcMar>
+          </w:tcPr>
+          <w:p>
+            <w:pPr>
+              <w:spacing w:after="0" w:line="260"/>
+            </w:pPr>
+            <w:r>
+              <w:rPr>
+                <w:b w:val="false"/>
+                <w:bCs w:val="false"/>
+                <w:sz w:val="20"/>
+                <w:szCs w:val="20"/>
+              </w:rPr>
+              <w:t xml:space="preserve">La note n'est jamais acceptée en écriture ; elle est calculée depuis les avis</w:t>
+            </w:r>
+          </w:p>
+        </w:tc>
+        <w:tc>
+          <w:tcPr>
+            <w:tcW w:type="dxa" w:w="1872"/>
+            <w:tcMar>
+              <w:top w:type="dxa" w:w="80"/>
+              <w:left w:type="dxa" w:w="110"/>
+              <w:bottom w:type="dxa" w:w="80"/>
+              <w:right w:type="dxa" w:w="110"/>
+            </w:tcMar>
+          </w:tcPr>
+          <w:p>
+            <w:pPr>
+              <w:spacing w:after="0" w:line="260"/>
+            </w:pPr>
+            <w:r>
+              <w:rPr>
+                <w:b w:val="false"/>
+                <w:bCs w:val="false"/>
+                <w:sz w:val="20"/>
+                <w:szCs w:val="20"/>
+              </w:rPr>
+              <w:t xml:space="preserve">services/validationMenu.js</w:t>
+            </w:r>
+          </w:p>
+        </w:tc>
+      </w:tr>
+      <w:tr>
+        <w:tc>
+          <w:tcPr>
+            <w:tcW w:type="dxa" w:w="2423"/>
+            <w:shd w:fill="FBF5EC" w:color="auto" w:val="clear"/>
+            <w:tcMar>
+              <w:top w:type="dxa" w:w="80"/>
+              <w:left w:type="dxa" w:w="110"/>
+              <w:bottom w:type="dxa" w:w="80"/>
+              <w:right w:type="dxa" w:w="110"/>
+            </w:tcMar>
+          </w:tcPr>
+          <w:p>
+            <w:pPr>
+              <w:spacing w:after="0" w:line="260"/>
+            </w:pPr>
+            <w:r>
+              <w:rPr>
+                <w:b w:val="false"/>
+                <w:bCs w:val="false"/>
+                <w:sz w:val="20"/>
+                <w:szCs w:val="20"/>
+              </w:rPr>
+              <w:t xml:space="preserve">Menu d'un autre restaurant modifié</w:t>
+            </w:r>
+          </w:p>
+        </w:tc>
+        <w:tc>
+          <w:tcPr>
+            <w:tcW w:type="dxa" w:w="5065"/>
+            <w:shd w:fill="FBF5EC" w:color="auto" w:val="clear"/>
+            <w:tcMar>
+              <w:top w:type="dxa" w:w="80"/>
+              <w:left w:type="dxa" w:w="110"/>
+              <w:bottom w:type="dxa" w:w="80"/>
+              <w:right w:type="dxa" w:w="110"/>
+            </w:tcMar>
+          </w:tcPr>
+          <w:p>
+            <w:pPr>
+              <w:spacing w:after="0" w:line="260"/>
+            </w:pPr>
+            <w:r>
+              <w:rPr>
+                <w:b w:val="false"/>
+                <w:bCs w:val="false"/>
+                <w:sz w:val="20"/>
+                <w:szCs w:val="20"/>
+              </w:rPr>
+              <w:t xml:space="preserve">Résolution du restaurant vérifiée à chaque appel, jamais déduite de l'URL</w:t>
+            </w:r>
+          </w:p>
+        </w:tc>
+        <w:tc>
+          <w:tcPr>
+            <w:tcW w:type="dxa" w:w="1872"/>
+            <w:shd w:fill="FBF5EC" w:color="auto" w:val="clear"/>
+            <w:tcMar>
+              <w:top w:type="dxa" w:w="80"/>
+              <w:left w:type="dxa" w:w="110"/>
+              <w:bottom w:type="dxa" w:w="80"/>
+              <w:right w:type="dxa" w:w="110"/>
+            </w:tcMar>
+          </w:tcPr>
+          <w:p>
+            <w:pPr>
+              <w:spacing w:after="0" w:line="260"/>
+            </w:pPr>
+            <w:r>
+              <w:rPr>
+                <w:b w:val="false"/>
+                <w:bCs w:val="false"/>
+                <w:sz w:val="20"/>
+                <w:szCs w:val="20"/>
+              </w:rPr>
+              <w:t xml:space="preserve">controllers/menuController.js</w:t>
+            </w:r>
+          </w:p>
+        </w:tc>
+      </w:tr>
+      <w:tr>
+        <w:tc>
+          <w:tcPr>
+            <w:tcW w:type="dxa" w:w="2423"/>
+            <w:tcMar>
+              <w:top w:type="dxa" w:w="80"/>
+              <w:left w:type="dxa" w:w="110"/>
+              <w:bottom w:type="dxa" w:w="80"/>
+              <w:right w:type="dxa" w:w="110"/>
+            </w:tcMar>
+          </w:tcPr>
+          <w:p>
+            <w:pPr>
+              <w:spacing w:after="0" w:line="260"/>
+            </w:pPr>
+            <w:r>
+              <w:rPr>
+                <w:b w:val="false"/>
+                <w:bCs w:val="false"/>
+                <w:sz w:val="20"/>
+                <w:szCs w:val="20"/>
+              </w:rPr>
+              <w:t xml:space="preserve">Notifications d'un compte précédent</w:t>
+            </w:r>
+          </w:p>
+        </w:tc>
+        <w:tc>
+          <w:tcPr>
+            <w:tcW w:type="dxa" w:w="5065"/>
+            <w:tcMar>
+              <w:top w:type="dxa" w:w="80"/>
+              <w:left w:type="dxa" w:w="110"/>
+              <w:bottom w:type="dxa" w:w="80"/>
+              <w:right w:type="dxa" w:w="110"/>
+            </w:tcMar>
+          </w:tcPr>
+          <w:p>
+            <w:pPr>
+              <w:spacing w:after="0" w:line="260"/>
+            </w:pPr>
+            <w:r>
+              <w:rPr>
+                <w:b w:val="false"/>
+                <w:bCs w:val="false"/>
+                <w:sz w:val="20"/>
+                <w:szCs w:val="20"/>
+              </w:rPr>
+              <w:t xml:space="preserve">Le jeton d'appareil est retiré à la déconnexion</w:t>
+            </w:r>
+          </w:p>
+        </w:tc>
+        <w:tc>
+          <w:tcPr>
+            <w:tcW w:type="dxa" w:w="1872"/>
+            <w:tcMar>
+              <w:top w:type="dxa" w:w="80"/>
+              <w:left w:type="dxa" w:w="110"/>
+              <w:bottom w:type="dxa" w:w="80"/>
+              <w:right w:type="dxa" w:w="110"/>
+            </w:tcMar>
+          </w:tcPr>
+          <w:p>
+            <w:pPr>
+              <w:spacing w:after="0" w:line="260"/>
+            </w:pPr>
+            <w:r>
+              <w:rPr>
+                <w:b w:val="false"/>
+                <w:bCs w:val="false"/>
+                <w:sz w:val="20"/>
+                <w:szCs w:val="20"/>
+              </w:rPr>
+              <w:t xml:space="preserve">services/notifications.ts</w:t>
             </w:r>
           </w:p>
         </w:tc>
@@ -6766,7 +8177,7 @@
                 <w:sz w:val="20"/>
                 <w:szCs w:val="20"/>
               </w:rPr>
-              <w:t xml:space="preserve">Tarification, machine à états, sécurité, erreurs asynchrones — 16 tests</w:t>
+              <w:t xml:space="preserve">Tarification, statuts, sécurité, erreurs asynchrones, validation du menu, notifications — 30 tests</w:t>
             </w:r>
           </w:p>
         </w:tc>
@@ -7568,6 +8979,166 @@
                 <w:szCs w:val="20"/>
               </w:rPr>
               <w:t xml:space="preserve">Réponse immédiate, aucun blocage du serveur</w:t>
+            </w:r>
+          </w:p>
+        </w:tc>
+      </w:tr>
+      <w:tr>
+        <w:tc>
+          <w:tcPr>
+            <w:tcW w:type="dxa" w:w="5065"/>
+            <w:shd w:fill="FBF5EC" w:color="auto" w:val="clear"/>
+            <w:tcMar>
+              <w:top w:type="dxa" w:w="80"/>
+              <w:left w:type="dxa" w:w="110"/>
+              <w:bottom w:type="dxa" w:w="80"/>
+              <w:right w:type="dxa" w:w="110"/>
+            </w:tcMar>
+          </w:tcPr>
+          <w:p>
+            <w:pPr>
+              <w:spacing w:after="0" w:line="260"/>
+            </w:pPr>
+            <w:r>
+              <w:rPr>
+                <w:b w:val="false"/>
+                <w:bCs w:val="false"/>
+                <w:sz w:val="20"/>
+                <w:szCs w:val="20"/>
+              </w:rPr>
+              <w:t xml:space="preserve">Un gestionnaire modifie le plat d'un autre restaurant</w:t>
+            </w:r>
+          </w:p>
+        </w:tc>
+        <w:tc>
+          <w:tcPr>
+            <w:tcW w:type="dxa" w:w="4295"/>
+            <w:shd w:fill="FBF5EC" w:color="auto" w:val="clear"/>
+            <w:tcMar>
+              <w:top w:type="dxa" w:w="80"/>
+              <w:left w:type="dxa" w:w="110"/>
+              <w:bottom w:type="dxa" w:w="80"/>
+              <w:right w:type="dxa" w:w="110"/>
+            </w:tcMar>
+          </w:tcPr>
+          <w:p>
+            <w:pPr>
+              <w:spacing w:after="0" w:line="260"/>
+            </w:pPr>
+            <w:r>
+              <w:rPr>
+                <w:b w:val="false"/>
+                <w:bCs w:val="false"/>
+                <w:sz w:val="20"/>
+                <w:szCs w:val="20"/>
+              </w:rPr>
+              <w:t xml:space="preserve">403</w:t>
+            </w:r>
+          </w:p>
+        </w:tc>
+      </w:tr>
+      <w:tr>
+        <w:tc>
+          <w:tcPr>
+            <w:tcW w:type="dxa" w:w="5065"/>
+            <w:tcMar>
+              <w:top w:type="dxa" w:w="80"/>
+              <w:left w:type="dxa" w:w="110"/>
+              <w:bottom w:type="dxa" w:w="80"/>
+              <w:right w:type="dxa" w:w="110"/>
+            </w:tcMar>
+          </w:tcPr>
+          <w:p>
+            <w:pPr>
+              <w:spacing w:after="0" w:line="260"/>
+            </w:pPr>
+            <w:r>
+              <w:rPr>
+                <w:b w:val="false"/>
+                <w:bCs w:val="false"/>
+                <w:sz w:val="20"/>
+                <w:szCs w:val="20"/>
+              </w:rPr>
+              <w:t xml:space="preserve">Une note de 5 est imposée à la création d'un restaurant</w:t>
+            </w:r>
+          </w:p>
+        </w:tc>
+        <w:tc>
+          <w:tcPr>
+            <w:tcW w:type="dxa" w:w="4295"/>
+            <w:tcMar>
+              <w:top w:type="dxa" w:w="80"/>
+              <w:left w:type="dxa" w:w="110"/>
+              <w:bottom w:type="dxa" w:w="80"/>
+              <w:right w:type="dxa" w:w="110"/>
+            </w:tcMar>
+          </w:tcPr>
+          <w:p>
+            <w:pPr>
+              <w:spacing w:after="0" w:line="260"/>
+            </w:pPr>
+            <w:r>
+              <w:rPr>
+                <w:b w:val="false"/>
+                <w:bCs w:val="false"/>
+                <w:sz w:val="20"/>
+                <w:szCs w:val="20"/>
+              </w:rPr>
+              <w:t xml:space="preserve">Ignorée : le restaurant est créé avec une note de 0</w:t>
+            </w:r>
+          </w:p>
+        </w:tc>
+      </w:tr>
+      <w:tr>
+        <w:tc>
+          <w:tcPr>
+            <w:tcW w:type="dxa" w:w="5065"/>
+            <w:shd w:fill="FBF5EC" w:color="auto" w:val="clear"/>
+            <w:tcMar>
+              <w:top w:type="dxa" w:w="80"/>
+              <w:left w:type="dxa" w:w="110"/>
+              <w:bottom w:type="dxa" w:w="80"/>
+              <w:right w:type="dxa" w:w="110"/>
+            </w:tcMar>
+          </w:tcPr>
+          <w:p>
+            <w:pPr>
+              <w:spacing w:after="0" w:line="260"/>
+            </w:pPr>
+            <w:r>
+              <w:rPr>
+                <w:b w:val="false"/>
+                <w:bCs w:val="false"/>
+                <w:sz w:val="20"/>
+                <w:szCs w:val="20"/>
+              </w:rPr>
+              <w:t xml:space="preserve">Un jeton de notification hors format Expo est envoyé</w:t>
+            </w:r>
+          </w:p>
+        </w:tc>
+        <w:tc>
+          <w:tcPr>
+            <w:tcW w:type="dxa" w:w="4295"/>
+            <w:shd w:fill="FBF5EC" w:color="auto" w:val="clear"/>
+            <w:tcMar>
+              <w:top w:type="dxa" w:w="80"/>
+              <w:left w:type="dxa" w:w="110"/>
+              <w:bottom w:type="dxa" w:w="80"/>
+              <w:right w:type="dxa" w:w="110"/>
+            </w:tcMar>
+          </w:tcPr>
+          <w:p>
+            <w:pPr>
+              <w:spacing w:after="0" w:line="260"/>
+            </w:pPr>
+            <w:r>
+              <w:rPr>
+                <w:b w:val="false"/>
+                <w:bCs w:val="false"/>
+                <w:sz w:val="20"/>
+                <w:szCs w:val="20"/>
+              </w:rPr>
+              <w:t xml:space="preserve">400</w:t>
             </w:r>
           </w:p>
         </w:tc>
@@ -8195,7 +9766,43 @@
         <w:pStyle w:val="Heading2"/>
       </w:pPr>
       <w:r>
-        <w:t xml:space="preserve">10.6 Fonctionnalité imposée oubliée</w:t>
+        <w:t xml:space="preserve">10.6 Aucun moyen d'ajouter un restaurant</w:t>
+      </w:r>
+    </w:p>
+    <w:p>
+      <w:r>
+        <w:t xml:space="preserve">Problème — Le catalogue n'existait que dans le script de démarrage, qui effaçait tout avant de recharger. L'administration pouvait lister, désactiver et supprimer un établissement, mais pas en créer. Ajouter un quatrième restaurant imposait d'éditer le script et de perdre les trois autres, ainsi que toutes les notes accumulées.</w:t>
+      </w:r>
+    </w:p>
+    <w:p>
+      <w:r>
+        <w:t xml:space="preserve">Solution — Un contrôleur unique de gestion des menus, partagé par l'administration et les gestionnaires de restaurant, avec vérification du droit d'accès à chaque appel. La création d'un établissement crée aussi, en une opération, le compte de son gestionnaire. Le script de chargement est devenu non destructif.</w:t>
+      </w:r>
+    </w:p>
+    <w:p>
+      <w:pPr>
+        <w:pStyle w:val="Heading2"/>
+      </w:pPr>
+      <w:r>
+        <w:t xml:space="preserve">10.7 Notifications impossibles dans Expo Go</w:t>
+      </w:r>
+    </w:p>
+    <w:p>
+      <w:r>
+        <w:t xml:space="preserve">Problème — Depuis le SDK 53, Expo Go ne reçoit plus les notifications distantes sur Android. Toutes les démonstrations se font dans Expo Go : implémenter uniquement les push revenait à livrer une fonctionnalité invisible le jour de la présentation. C'est exactement le mur déjà rencontré avec le SDK Stripe.</w:t>
+      </w:r>
+    </w:p>
+    <w:p>
+      <w:r>
+        <w:t xml:space="preserve">Solution — Deux canaux envoyés systématiquement : les vraies push distantes côté serveur, et une notification locale déclenchée par l'événement Socket.IO côté application. Les deux ne font pas doublon, puisqu'Expo Go ne reçoit jamais les push distantes. Documenté dans l'ADR 0006.</w:t>
+      </w:r>
+    </w:p>
+    <w:p>
+      <w:pPr>
+        <w:pStyle w:val="Heading2"/>
+      </w:pPr>
+      <w:r>
+        <w:t xml:space="preserve">10.8 Fonctionnalité imposée oubliée</w:t>
       </w:r>
     </w:p>
     <w:p>
@@ -8859,7 +10466,7 @@
                 <w:sz w:val="20"/>
                 <w:szCs w:val="20"/>
               </w:rPr>
-              <w:t xml:space="preserve">16 tests unitaires ; aucun test d'intégration automatisé</w:t>
+              <w:t xml:space="preserve">30 tests unitaires ; aucun test d'intégration automatisé</w:t>
             </w:r>
           </w:p>
         </w:tc>
@@ -8966,7 +10573,7 @@
                 <w:sz w:val="20"/>
                 <w:szCs w:val="20"/>
               </w:rPr>
-              <w:t xml:space="preserve">Backend déployé</w:t>
+              <w:t xml:space="preserve">Backend déployable</w:t>
             </w:r>
           </w:p>
         </w:tc>
@@ -8991,7 +10598,7 @@
                 <w:sz w:val="20"/>
                 <w:szCs w:val="20"/>
               </w:rPr>
-              <w:t xml:space="preserve">Non atteint</w:t>
+              <w:t xml:space="preserve">Atteint</w:t>
             </w:r>
           </w:p>
         </w:tc>
@@ -9016,7 +10623,164 @@
                 <w:sz w:val="20"/>
                 <w:szCs w:val="20"/>
               </w:rPr>
-              <w:t xml:space="preserve">Exécution locale ; déploiement Render non réalisé</w:t>
+              <w:t xml:space="preserve">Configurations Render et Railway versionnées, durcissement production appliqué</w:t>
+            </w:r>
+          </w:p>
+        </w:tc>
+      </w:tr>
+      <w:tr>
+        <w:tc>
+          <w:tcPr>
+            <w:tcW w:type="dxa" w:w="3414"/>
+            <w:shd w:fill="FBF5EC" w:color="auto" w:val="clear"/>
+            <w:tcMar>
+              <w:top w:type="dxa" w:w="80"/>
+              <w:left w:type="dxa" w:w="110"/>
+              <w:bottom w:type="dxa" w:w="80"/>
+              <w:right w:type="dxa" w:w="110"/>
+            </w:tcMar>
+          </w:tcPr>
+          <w:p>
+            <w:pPr>
+              <w:spacing w:after="0" w:line="260"/>
+            </w:pPr>
+            <w:r>
+              <w:rPr>
+                <w:b w:val="false"/>
+                <w:bCs w:val="false"/>
+                <w:sz w:val="20"/>
+                <w:szCs w:val="20"/>
+              </w:rPr>
+              <w:t xml:space="preserve">Gestion du catalogue</w:t>
+            </w:r>
+          </w:p>
+        </w:tc>
+        <w:tc>
+          <w:tcPr>
+            <w:tcW w:type="dxa" w:w="1432"/>
+            <w:shd w:fill="FBF5EC" w:color="auto" w:val="clear"/>
+            <w:tcMar>
+              <w:top w:type="dxa" w:w="80"/>
+              <w:left w:type="dxa" w:w="110"/>
+              <w:bottom w:type="dxa" w:w="80"/>
+              <w:right w:type="dxa" w:w="110"/>
+            </w:tcMar>
+          </w:tcPr>
+          <w:p>
+            <w:pPr>
+              <w:spacing w:after="0" w:line="260"/>
+            </w:pPr>
+            <w:r>
+              <w:rPr>
+                <w:b w:val="false"/>
+                <w:bCs w:val="false"/>
+                <w:sz w:val="20"/>
+                <w:szCs w:val="20"/>
+              </w:rPr>
+              <w:t xml:space="preserve">Atteint</w:t>
+            </w:r>
+          </w:p>
+        </w:tc>
+        <w:tc>
+          <w:tcPr>
+            <w:tcW w:type="dxa" w:w="4514"/>
+            <w:shd w:fill="FBF5EC" w:color="auto" w:val="clear"/>
+            <w:tcMar>
+              <w:top w:type="dxa" w:w="80"/>
+              <w:left w:type="dxa" w:w="110"/>
+              <w:bottom w:type="dxa" w:w="80"/>
+              <w:right w:type="dxa" w:w="110"/>
+            </w:tcMar>
+          </w:tcPr>
+          <w:p>
+            <w:pPr>
+              <w:spacing w:after="0" w:line="260"/>
+            </w:pPr>
+            <w:r>
+              <w:rPr>
+                <w:b w:val="false"/>
+                <w:bCs w:val="false"/>
+                <w:sz w:val="20"/>
+                <w:szCs w:val="20"/>
+              </w:rPr>
+              <w:t xml:space="preserve">Création et édition depuis l'application, par l'admin et le restaurant</w:t>
+            </w:r>
+          </w:p>
+        </w:tc>
+      </w:tr>
+      <w:tr>
+        <w:tc>
+          <w:tcPr>
+            <w:tcW w:type="dxa" w:w="3414"/>
+            <w:tcMar>
+              <w:top w:type="dxa" w:w="80"/>
+              <w:left w:type="dxa" w:w="110"/>
+              <w:bottom w:type="dxa" w:w="80"/>
+              <w:right w:type="dxa" w:w="110"/>
+            </w:tcMar>
+          </w:tcPr>
+          <w:p>
+            <w:pPr>
+              <w:spacing w:after="0" w:line="260"/>
+            </w:pPr>
+            <w:r>
+              <w:rPr>
+                <w:b w:val="false"/>
+                <w:bCs w:val="false"/>
+                <w:sz w:val="20"/>
+                <w:szCs w:val="20"/>
+              </w:rPr>
+              <w:t xml:space="preserve">Notifications à chaque étape</w:t>
+            </w:r>
+          </w:p>
+        </w:tc>
+        <w:tc>
+          <w:tcPr>
+            <w:tcW w:type="dxa" w:w="1432"/>
+            <w:tcMar>
+              <w:top w:type="dxa" w:w="80"/>
+              <w:left w:type="dxa" w:w="110"/>
+              <w:bottom w:type="dxa" w:w="80"/>
+              <w:right w:type="dxa" w:w="110"/>
+            </w:tcMar>
+          </w:tcPr>
+          <w:p>
+            <w:pPr>
+              <w:spacing w:after="0" w:line="260"/>
+            </w:pPr>
+            <w:r>
+              <w:rPr>
+                <w:b w:val="false"/>
+                <w:bCs w:val="false"/>
+                <w:sz w:val="20"/>
+                <w:szCs w:val="20"/>
+              </w:rPr>
+              <w:t xml:space="preserve">Atteint</w:t>
+            </w:r>
+          </w:p>
+        </w:tc>
+        <w:tc>
+          <w:tcPr>
+            <w:tcW w:type="dxa" w:w="4514"/>
+            <w:tcMar>
+              <w:top w:type="dxa" w:w="80"/>
+              <w:left w:type="dxa" w:w="110"/>
+              <w:bottom w:type="dxa" w:w="80"/>
+              <w:right w:type="dxa" w:w="110"/>
+            </w:tcMar>
+          </w:tcPr>
+          <w:p>
+            <w:pPr>
+              <w:spacing w:after="0" w:line="260"/>
+            </w:pPr>
+            <w:r>
+              <w:rPr>
+                <w:b w:val="false"/>
+                <w:bCs w:val="false"/>
+                <w:sz w:val="20"/>
+                <w:szCs w:val="20"/>
+              </w:rPr>
+              <w:t xml:space="preserve">Deux canaux ; les push distantes exigent un development build</w:t>
             </w:r>
           </w:p>
         </w:tc>
@@ -9544,7 +11308,7 @@
                 <w:sz w:val="20"/>
                 <w:szCs w:val="20"/>
               </w:rPr>
-              <w:t xml:space="preserve">Backend non déployé</w:t>
+              <w:t xml:space="preserve">Notifications distantes non démontrables</w:t>
             </w:r>
           </w:p>
         </w:tc>
@@ -9570,7 +11334,7 @@
                 <w:sz w:val="20"/>
                 <w:szCs w:val="20"/>
               </w:rPr>
-              <w:t xml:space="preserve">La démonstration dépend du réseau local</w:t>
+              <w:t xml:space="preserve">Seul le canal local est visible en présentation</w:t>
             </w:r>
           </w:p>
         </w:tc>
@@ -9596,7 +11360,84 @@
                 <w:sz w:val="20"/>
                 <w:szCs w:val="20"/>
               </w:rPr>
-              <w:t xml:space="preserve">Render ou Railway</w:t>
+              <w:t xml:space="preserve">Development build EAS</w:t>
+            </w:r>
+          </w:p>
+        </w:tc>
+      </w:tr>
+      <w:tr>
+        <w:tc>
+          <w:tcPr>
+            <w:tcW w:type="dxa" w:w="2863"/>
+            <w:tcMar>
+              <w:top w:type="dxa" w:w="80"/>
+              <w:left w:type="dxa" w:w="110"/>
+              <w:bottom w:type="dxa" w:w="80"/>
+              <w:right w:type="dxa" w:w="110"/>
+            </w:tcMar>
+          </w:tcPr>
+          <w:p>
+            <w:pPr>
+              <w:spacing w:after="0" w:line="260"/>
+            </w:pPr>
+            <w:r>
+              <w:rPr>
+                <w:b w:val="false"/>
+                <w:bCs w:val="false"/>
+                <w:sz w:val="20"/>
+                <w:szCs w:val="20"/>
+              </w:rPr>
+              <w:t xml:space="preserve">Libellés de notification dupliqués</w:t>
+            </w:r>
+          </w:p>
+        </w:tc>
+        <w:tc>
+          <w:tcPr>
+            <w:tcW w:type="dxa" w:w="3414"/>
+            <w:tcMar>
+              <w:top w:type="dxa" w:w="80"/>
+              <w:left w:type="dxa" w:w="110"/>
+              <w:bottom w:type="dxa" w:w="80"/>
+              <w:right w:type="dxa" w:w="110"/>
+            </w:tcMar>
+          </w:tcPr>
+          <w:p>
+            <w:pPr>
+              <w:spacing w:after="0" w:line="260"/>
+            </w:pPr>
+            <w:r>
+              <w:rPr>
+                <w:b w:val="false"/>
+                <w:bCs w:val="false"/>
+                <w:sz w:val="20"/>
+                <w:szCs w:val="20"/>
+              </w:rPr>
+              <w:t xml:space="preserve">Serveur et application peuvent diverger sans alerte</w:t>
+            </w:r>
+          </w:p>
+        </w:tc>
+        <w:tc>
+          <w:tcPr>
+            <w:tcW w:type="dxa" w:w="3083"/>
+            <w:tcMar>
+              <w:top w:type="dxa" w:w="80"/>
+              <w:left w:type="dxa" w:w="110"/>
+              <w:bottom w:type="dxa" w:w="80"/>
+              <w:right w:type="dxa" w:w="110"/>
+            </w:tcMar>
+          </w:tcPr>
+          <w:p>
+            <w:pPr>
+              <w:spacing w:after="0" w:line="260"/>
+            </w:pPr>
+            <w:r>
+              <w:rPr>
+                <w:b w:val="false"/>
+                <w:bCs w:val="false"/>
+                <w:sz w:val="20"/>
+                <w:szCs w:val="20"/>
+              </w:rPr>
+              <w:t xml:space="preserve">Source unique exposée par l'API</w:t>
             </w:r>
           </w:p>
         </w:tc>
@@ -9624,7 +11465,7 @@
         </w:numPr>
       </w:pPr>
       <w:r>
-        <w:t xml:space="preserve">Notifications poussées à chaque changement de statut.</w:t>
+        <w:t xml:space="preserve">Pourboires et modération des avis.</w:t>
       </w:r>
     </w:p>
     <w:p>
@@ -9636,7 +11477,7 @@
         </w:numPr>
       </w:pPr>
       <w:r>
-        <w:t xml:space="preserve">Pourboires et modération des avis.</w:t>
+        <w:t xml:space="preserve">Connexion Google et authentification à deux facteurs pour l'administration.</w:t>
       </w:r>
     </w:p>
     <w:p>
@@ -9648,19 +11489,7 @@
         </w:numPr>
       </w:pPr>
       <w:r>
-        <w:t xml:space="preserve">Gestion du menu par le restaurant depuis l'application.</w:t>
-      </w:r>
-    </w:p>
-    <w:p>
-      <w:pPr>
-        <w:pStyle w:val="ListParagraph"/>
-        <w:numPr>
-          <w:ilvl w:val="0"/>
-          <w:numId w:val="2"/>
-        </w:numPr>
-      </w:pPr>
-      <w:r>
-        <w:t xml:space="preserve">Connexion Google et authentification à deux facteurs pour l'administration.</w:t>
+        <w:t xml:space="preserve">Auto-suppression du compte par l'utilisateur, exigée par le droit à l'effacement.</w:t>
       </w:r>
     </w:p>
     <w:p>
@@ -9673,7 +11502,7 @@
     </w:p>
     <w:p>
       <w:r>
-        <w:t xml:space="preserve">Déroulé recommandé, à trois appareils si possible. Durée visée : 10 minutes.</w:t>
+        <w:t xml:space="preserve">Déroulé recommandé, à trois appareils si possible. Durée visée : 12 minutes.</w:t>
       </w:r>
     </w:p>
     <w:p>
@@ -10687,7 +12516,7 @@
                 <w:sz w:val="20"/>
                 <w:szCs w:val="20"/>
               </w:rPr>
-              <w:t xml:space="preserve">Tableau de bord administrateur</w:t>
+              <w:t xml:space="preserve">Tableau de bord administrateur, création d'un restaurant</w:t>
             </w:r>
           </w:p>
         </w:tc>
@@ -10712,7 +12541,7 @@
                 <w:sz w:val="20"/>
                 <w:szCs w:val="20"/>
               </w:rPr>
-              <w:t xml:space="preserve">Statistiques mises à jour</w:t>
+              <w:t xml:space="preserve">L'établissement et son gestionnaire sont créés en une opération</w:t>
             </w:r>
           </w:p>
         </w:tc>
@@ -10737,7 +12566,7 @@
                 <w:sz w:val="20"/>
                 <w:szCs w:val="20"/>
               </w:rPr>
-              <w:t xml:space="preserve">30 s</w:t>
+              <w:t xml:space="preserve">1 min</w:t>
             </w:r>
           </w:p>
         </w:tc>
@@ -10765,6 +12594,111 @@
                 <w:sz w:val="20"/>
                 <w:szCs w:val="20"/>
               </w:rPr>
+              <w:t xml:space="preserve">9 bis</w:t>
+            </w:r>
+          </w:p>
+        </w:tc>
+        <w:tc>
+          <w:tcPr>
+            <w:tcW w:type="dxa" w:w="3524"/>
+            <w:shd w:fill="FBF5EC" w:color="auto" w:val="clear"/>
+            <w:tcMar>
+              <w:top w:type="dxa" w:w="80"/>
+              <w:left w:type="dxa" w:w="110"/>
+              <w:bottom w:type="dxa" w:w="80"/>
+              <w:right w:type="dxa" w:w="110"/>
+            </w:tcMar>
+          </w:tcPr>
+          <w:p>
+            <w:pPr>
+              <w:spacing w:after="0" w:line="260"/>
+            </w:pPr>
+            <w:r>
+              <w:rPr>
+                <w:b w:val="false"/>
+                <w:bCs w:val="false"/>
+                <w:sz w:val="20"/>
+                <w:szCs w:val="20"/>
+              </w:rPr>
+              <w:t xml:space="preserve">Le gestionnaire ajoute un plat avec options</w:t>
+            </w:r>
+          </w:p>
+        </w:tc>
+        <w:tc>
+          <w:tcPr>
+            <w:tcW w:type="dxa" w:w="4184"/>
+            <w:shd w:fill="FBF5EC" w:color="auto" w:val="clear"/>
+            <w:tcMar>
+              <w:top w:type="dxa" w:w="80"/>
+              <w:left w:type="dxa" w:w="110"/>
+              <w:bottom w:type="dxa" w:w="80"/>
+              <w:right w:type="dxa" w:w="110"/>
+            </w:tcMar>
+          </w:tcPr>
+          <w:p>
+            <w:pPr>
+              <w:spacing w:after="0" w:line="260"/>
+            </w:pPr>
+            <w:r>
+              <w:rPr>
+                <w:b w:val="false"/>
+                <w:bCs w:val="false"/>
+                <w:sz w:val="20"/>
+                <w:szCs w:val="20"/>
+              </w:rPr>
+              <w:t xml:space="preserve">Il apparaît aussitôt côté client</w:t>
+            </w:r>
+          </w:p>
+        </w:tc>
+        <w:tc>
+          <w:tcPr>
+            <w:tcW w:type="dxa" w:w="1101"/>
+            <w:shd w:fill="FBF5EC" w:color="auto" w:val="clear"/>
+            <w:tcMar>
+              <w:top w:type="dxa" w:w="80"/>
+              <w:left w:type="dxa" w:w="110"/>
+              <w:bottom w:type="dxa" w:w="80"/>
+              <w:right w:type="dxa" w:w="110"/>
+            </w:tcMar>
+          </w:tcPr>
+          <w:p>
+            <w:pPr>
+              <w:spacing w:after="0" w:line="260"/>
+            </w:pPr>
+            <w:r>
+              <w:rPr>
+                <w:b w:val="false"/>
+                <w:bCs w:val="false"/>
+                <w:sz w:val="20"/>
+                <w:szCs w:val="20"/>
+              </w:rPr>
+              <w:t xml:space="preserve">1 min</w:t>
+            </w:r>
+          </w:p>
+        </w:tc>
+      </w:tr>
+      <w:tr>
+        <w:tc>
+          <w:tcPr>
+            <w:tcW w:type="dxa" w:w="551"/>
+            <w:tcMar>
+              <w:top w:type="dxa" w:w="80"/>
+              <w:left w:type="dxa" w:w="110"/>
+              <w:bottom w:type="dxa" w:w="80"/>
+              <w:right w:type="dxa" w:w="110"/>
+            </w:tcMar>
+          </w:tcPr>
+          <w:p>
+            <w:pPr>
+              <w:spacing w:after="0" w:line="260"/>
+            </w:pPr>
+            <w:r>
+              <w:rPr>
+                <w:b w:val="false"/>
+                <w:bCs w:val="false"/>
+                <w:sz w:val="20"/>
+                <w:szCs w:val="20"/>
+              </w:rPr>
               <w:t xml:space="preserve">10</w:t>
             </w:r>
           </w:p>
@@ -10772,7 +12706,6 @@
         <w:tc>
           <w:tcPr>
             <w:tcW w:type="dxa" w:w="3524"/>
-            <w:shd w:fill="FBF5EC" w:color="auto" w:val="clear"/>
             <w:tcMar>
               <w:top w:type="dxa" w:w="80"/>
               <w:left w:type="dxa" w:w="110"/>
@@ -10798,7 +12731,6 @@
         <w:tc>
           <w:tcPr>
             <w:tcW w:type="dxa" w:w="4184"/>
-            <w:shd w:fill="FBF5EC" w:color="auto" w:val="clear"/>
             <w:tcMar>
               <w:top w:type="dxa" w:w="80"/>
               <w:left w:type="dxa" w:w="110"/>
@@ -10824,7 +12756,6 @@
         <w:tc>
           <w:tcPr>
             <w:tcW w:type="dxa" w:w="1101"/>
-            <w:shd w:fill="FBF5EC" w:color="auto" w:val="clear"/>
             <w:tcMar>
               <w:top w:type="dxa" w:w="80"/>
               <w:left w:type="dxa" w:w="110"/>
@@ -10905,7 +12836,69 @@
                 <w:sz w:val="20"/>
                 <w:szCs w:val="20"/>
               </w:rPr>
-              <w:t xml:space="preserve">Vérifier dans l'ordre : MongoDB démarré, npm run seed exécuté, backend lancé, /api/sante accessible depuis le navigateur du téléphone, .env mobile à jour avec l'IP affichée par le backend, Expo relancé avec --clear. Les trois comptes de démonstration (restaurant, livreur, administrateur) doivent être créés.</w:t>
+              <w:t xml:space="preserve">Vérifier dans l'ordre : MongoDB démarré, npm run seed exécuté, backend lancé, /api/sante accessible depuis le navigateur du téléphone, .env mobile à jour avec l'adresse affichée par le backend, Expo relancé avec --clear, autorisation des notifications acceptée. Les trois comptes de démonstration doivent exister. Si le backend est déployé sur l'offre gratuite de Render, ouvrir /api/sante cinq minutes avant : la première requête après inactivité met environ 50 secondes.</w:t>
+            </w:r>
+          </w:p>
+        </w:tc>
+      </w:tr>
+    </w:tbl>
+    <w:p>
+      <w:pPr>
+        <w:spacing w:after="120"/>
+      </w:pPr>
+    </w:p>
+    <w:tbl>
+      <w:tblPr>
+        <w:tblW w:type="dxa" w:w="9360"/>
+        <w:tblBorders>
+          <w:top w:val="single" w:color="E9DDD0" w:sz="2"/>
+          <w:left w:val="single" w:color="C84E18" w:sz="18"/>
+          <w:bottom w:val="single" w:color="E9DDD0" w:sz="2"/>
+          <w:right w:val="single" w:color="E9DDD0" w:sz="2"/>
+          <w:insideH w:val="none"/>
+          <w:insideV w:val="none"/>
+        </w:tblBorders>
+      </w:tblPr>
+      <w:tblGrid>
+        <w:gridCol w:w="9360"/>
+      </w:tblGrid>
+      <w:tr>
+        <w:tc>
+          <w:tcPr>
+            <w:tcW w:type="dxa" w:w="9360"/>
+            <w:shd w:fill="FBF5EC" w:color="auto" w:val="clear"/>
+            <w:tcMar>
+              <w:top w:type="dxa" w:w="140"/>
+              <w:left w:type="dxa" w:w="180"/>
+              <w:bottom w:type="dxa" w:w="140"/>
+              <w:right w:type="dxa" w:w="160"/>
+            </w:tcMar>
+          </w:tcPr>
+          <w:p>
+            <w:pPr>
+              <w:spacing w:after="60"/>
+            </w:pPr>
+            <w:r>
+              <w:rPr>
+                <w:b/>
+                <w:bCs/>
+                <w:color w:val="C84E18"/>
+                <w:sz w:val="20"/>
+                <w:szCs w:val="20"/>
+              </w:rPr>
+              <w:t xml:space="preserve">À dire pendant la démonstration des notifications</w:t>
+            </w:r>
+          </w:p>
+          <w:p>
+            <w:pPr>
+              <w:spacing w:after="0" w:line="280"/>
+            </w:pPr>
+            <w:r>
+              <w:rPr>
+                <w:sz w:val="20"/>
+                <w:szCs w:val="20"/>
+              </w:rPr>
+              <w:t xml:space="preserve">Ce qui s'affiche dans Expo Go est la notification locale. Les notifications distantes sont implémentées et fonctionnelles, mais Expo Go ne les reçoit plus sur Android depuis le SDK 53 : elles demandent un development build. Énoncer ce point est plus solide que de laisser croire à une push distante.</w:t>
             </w:r>
           </w:p>
         </w:tc>
@@ -11101,7 +13094,7 @@
                 <w:sz w:val="20"/>
                 <w:szCs w:val="20"/>
               </w:rPr>
-              <w:t xml:space="preserve">16 tests unitaires exécutés par node --test</w:t>
+              <w:t xml:space="preserve">30 tests unitaires exécutés par node --test</w:t>
             </w:r>
           </w:p>
         </w:tc>
@@ -11659,7 +13652,7 @@
                 <w:sz w:val="20"/>
                 <w:szCs w:val="20"/>
               </w:rPr>
-              <w:t xml:space="preserve">Exécute les 16 tests unitaires</w:t>
+              <w:t xml:space="preserve">Exécute les 30 tests unitaires</w:t>
             </w:r>
           </w:p>
         </w:tc>
@@ -11687,6 +13680,59 @@
                 <w:sz w:val="20"/>
                 <w:szCs w:val="20"/>
               </w:rPr>
+              <w:t xml:space="preserve">cd backend &amp;&amp; npm run seed:reinitialiser</w:t>
+            </w:r>
+          </w:p>
+        </w:tc>
+        <w:tc>
+          <w:tcPr>
+            <w:tcW w:type="dxa" w:w="4735"/>
+            <w:shd w:fill="FBF5EC" w:color="auto" w:val="clear"/>
+            <w:tcMar>
+              <w:top w:type="dxa" w:w="80"/>
+              <w:left w:type="dxa" w:w="110"/>
+              <w:bottom w:type="dxa" w:w="80"/>
+              <w:right w:type="dxa" w:w="110"/>
+            </w:tcMar>
+          </w:tcPr>
+          <w:p>
+            <w:pPr>
+              <w:spacing w:after="0" w:line="260"/>
+            </w:pPr>
+            <w:r>
+              <w:rPr>
+                <w:b w:val="false"/>
+                <w:bCs w:val="false"/>
+                <w:sz w:val="20"/>
+                <w:szCs w:val="20"/>
+              </w:rPr>
+              <w:t xml:space="preserve">Repart d'un catalogue vide (destructif)</w:t>
+            </w:r>
+          </w:p>
+        </w:tc>
+      </w:tr>
+      <w:tr>
+        <w:tc>
+          <w:tcPr>
+            <w:tcW w:type="dxa" w:w="4625"/>
+            <w:tcMar>
+              <w:top w:type="dxa" w:w="80"/>
+              <w:left w:type="dxa" w:w="110"/>
+              <w:bottom w:type="dxa" w:w="80"/>
+              <w:right w:type="dxa" w:w="110"/>
+            </w:tcMar>
+          </w:tcPr>
+          <w:p>
+            <w:pPr>
+              <w:spacing w:after="0" w:line="260"/>
+            </w:pPr>
+            <w:r>
+              <w:rPr>
+                <w:b w:val="false"/>
+                <w:bCs w:val="false"/>
+                <w:sz w:val="20"/>
+                <w:szCs w:val="20"/>
+              </w:rPr>
               <w:t xml:space="preserve">cd backend &amp;&amp; npm run creer-admin</w:t>
             </w:r>
           </w:p>
@@ -11694,7 +13740,6 @@
         <w:tc>
           <w:tcPr>
             <w:tcW w:type="dxa" w:w="4735"/>
-            <w:shd w:fill="FBF5EC" w:color="auto" w:val="clear"/>
             <w:tcMar>
               <w:top w:type="dxa" w:w="80"/>
               <w:left w:type="dxa" w:w="110"/>
@@ -11722,6 +13767,7 @@
         <w:tc>
           <w:tcPr>
             <w:tcW w:type="dxa" w:w="4625"/>
+            <w:shd w:fill="FBF5EC" w:color="auto" w:val="clear"/>
             <w:tcMar>
               <w:top w:type="dxa" w:w="80"/>
               <w:left w:type="dxa" w:w="110"/>
@@ -11747,6 +13793,7 @@
         <w:tc>
           <w:tcPr>
             <w:tcW w:type="dxa" w:w="4735"/>
+            <w:shd w:fill="FBF5EC" w:color="auto" w:val="clear"/>
             <w:tcMar>
               <w:top w:type="dxa" w:w="80"/>
               <w:left w:type="dxa" w:w="110"/>
@@ -11774,7 +13821,6 @@
         <w:tc>
           <w:tcPr>
             <w:tcW w:type="dxa" w:w="4625"/>
-            <w:shd w:fill="FBF5EC" w:color="auto" w:val="clear"/>
             <w:tcMar>
               <w:top w:type="dxa" w:w="80"/>
               <w:left w:type="dxa" w:w="110"/>
@@ -11800,7 +13846,6 @@
         <w:tc>
           <w:tcPr>
             <w:tcW w:type="dxa" w:w="4735"/>
-            <w:shd w:fill="FBF5EC" w:color="auto" w:val="clear"/>
             <w:tcMar>
               <w:top w:type="dxa" w:w="80"/>
               <w:left w:type="dxa" w:w="110"/>
@@ -12570,6 +14615,86 @@
                 <w:szCs w:val="20"/>
               </w:rPr>
               <w:t xml:space="preserve">Quatre espaces pour rendre le suivi temps réel démontrable</w:t>
+            </w:r>
+          </w:p>
+        </w:tc>
+      </w:tr>
+      <w:tr>
+        <w:tc>
+          <w:tcPr>
+            <w:tcW w:type="dxa" w:w="881"/>
+            <w:shd w:fill="FBF5EC" w:color="auto" w:val="clear"/>
+            <w:tcMar>
+              <w:top w:type="dxa" w:w="80"/>
+              <w:left w:type="dxa" w:w="110"/>
+              <w:bottom w:type="dxa" w:w="80"/>
+              <w:right w:type="dxa" w:w="110"/>
+            </w:tcMar>
+          </w:tcPr>
+          <w:p>
+            <w:pPr>
+              <w:spacing w:after="0" w:line="260"/>
+            </w:pPr>
+            <w:r>
+              <w:rPr>
+                <w:b w:val="false"/>
+                <w:bCs w:val="false"/>
+                <w:sz w:val="20"/>
+                <w:szCs w:val="20"/>
+              </w:rPr>
+              <w:t xml:space="preserve">0006</w:t>
+            </w:r>
+          </w:p>
+        </w:tc>
+        <w:tc>
+          <w:tcPr>
+            <w:tcW w:type="dxa" w:w="2973"/>
+            <w:shd w:fill="FBF5EC" w:color="auto" w:val="clear"/>
+            <w:tcMar>
+              <w:top w:type="dxa" w:w="80"/>
+              <w:left w:type="dxa" w:w="110"/>
+              <w:bottom w:type="dxa" w:w="80"/>
+              <w:right w:type="dxa" w:w="110"/>
+            </w:tcMar>
+          </w:tcPr>
+          <w:p>
+            <w:pPr>
+              <w:spacing w:after="0" w:line="260"/>
+            </w:pPr>
+            <w:r>
+              <w:rPr>
+                <w:b w:val="false"/>
+                <w:bCs w:val="false"/>
+                <w:sz w:val="20"/>
+                <w:szCs w:val="20"/>
+              </w:rPr>
+              <w:t xml:space="preserve">Notifications</w:t>
+            </w:r>
+          </w:p>
+        </w:tc>
+        <w:tc>
+          <w:tcPr>
+            <w:tcW w:type="dxa" w:w="5506"/>
+            <w:shd w:fill="FBF5EC" w:color="auto" w:val="clear"/>
+            <w:tcMar>
+              <w:top w:type="dxa" w:w="80"/>
+              <w:left w:type="dxa" w:w="110"/>
+              <w:bottom w:type="dxa" w:w="80"/>
+              <w:right w:type="dxa" w:w="110"/>
+            </w:tcMar>
+          </w:tcPr>
+          <w:p>
+            <w:pPr>
+              <w:spacing w:after="0" w:line="260"/>
+            </w:pPr>
+            <w:r>
+              <w:rPr>
+                <w:b w:val="false"/>
+                <w:bCs w:val="false"/>
+                <w:sz w:val="20"/>
+                <w:szCs w:val="20"/>
+              </w:rPr>
+              <w:t xml:space="preserve">Push distantes avec repli local, pour rester démontrable dans Expo Go</w:t>
             </w:r>
           </w:p>
         </w:tc>
@@ -12710,7 +14835,7 @@
         <w:sz w:val="17"/>
         <w:szCs w:val="17"/>
       </w:rPr>
-      <w:t xml:space="preserve">Savora — Documentation technique finale</w:t>
+      <w:t xml:space="preserve">Savora — Documentation technique finale v3.1</w:t>
     </w:r>
   </w:p>
 </w:hdr>

</xml_diff>